<commit_message>
docs: expand summer training report with massive 30+ page detailed content and code blocks
</commit_message>
<xml_diff>
--- a/docs/RepoVerse_AI_Summer_Training_Report.docx
+++ b/docs/RepoVerse_AI_Summer_Training_Report.docx
@@ -4,17 +4,19 @@
   <w:body>
     <w:p>
       <w:pPr>
+        <w:spacing w:before="800"/>
         <w:jc w:val="center"/>
       </w:pPr>
       <w:r>
         <w:rPr>
           <w:rFonts w:ascii="Times New Roman" w:hAnsi="Times New Roman"/>
           <w:b/>
-          <w:sz w:val="28"/>
+          <w:sz w:val="32"/>
         </w:rPr>
         <w:t>SUMMER TRAINING/INTERNSHIP REPORT</w:t>
         <w:br/>
         <w:t>(Term Aug-Dec 2026)</w:t>
+        <w:br/>
         <w:br/>
         <w:br/>
       </w:r>
@@ -22,23 +24,24 @@
     <w:p>
       <w:pPr>
         <w:spacing w:after="40"/>
+        <w:ind w:left="2160"/>
         <w:jc w:val="left"/>
       </w:pPr>
       <w:r>
         <w:rPr>
           <w:rFonts w:ascii="Times New Roman" w:hAnsi="Times New Roman"/>
           <w:b/>
-          <w:sz w:val="22"/>
+          <w:sz w:val="23"/>
           <w:u w:val="single"/>
         </w:rPr>
-        <w:t>Live Deployment</w:t>
+        <w:t>Live System Deployment Details:</w:t>
         <w:br/>
       </w:r>
     </w:p>
     <w:p>
       <w:pPr>
-        <w:spacing w:after="120" w:line="276" w:lineRule="auto"/>
-        <w:jc w:val="both"/>
+        <w:spacing w:after="40"/>
+        <w:ind w:left="2160"/>
       </w:pPr>
       <w:r>
         <w:rPr>
@@ -46,7 +49,7 @@
           <w:b/>
           <w:sz w:val="22"/>
         </w:rPr>
-        <w:t xml:space="preserve">Github: </w:t>
+        <w:t xml:space="preserve">GitHub Code Repository: </w:t>
       </w:r>
       <w:r>
         <w:rPr>
@@ -58,8 +61,8 @@
     </w:p>
     <w:p>
       <w:pPr>
-        <w:spacing w:after="120" w:line="276" w:lineRule="auto"/>
-        <w:jc w:val="both"/>
+        <w:spacing w:after="40"/>
+        <w:ind w:left="2160"/>
       </w:pPr>
       <w:r>
         <w:rPr>
@@ -67,7 +70,7 @@
           <w:b/>
           <w:sz w:val="22"/>
         </w:rPr>
-        <w:t xml:space="preserve">Frontend (Live Demo): </w:t>
+        <w:t xml:space="preserve">Static Cloud Frontend: </w:t>
       </w:r>
       <w:r>
         <w:rPr>
@@ -79,8 +82,8 @@
     </w:p>
     <w:p>
       <w:pPr>
-        <w:spacing w:after="120" w:line="276" w:lineRule="auto"/>
-        <w:jc w:val="both"/>
+        <w:spacing w:after="40"/>
+        <w:ind w:left="2160"/>
       </w:pPr>
       <w:r>
         <w:rPr>
@@ -88,35 +91,18 @@
           <w:b/>
           <w:sz w:val="22"/>
         </w:rPr>
-        <w:t xml:space="preserve">Backend (API Service): </w:t>
+        <w:t xml:space="preserve">Docker API Web Service: </w:t>
       </w:r>
       <w:r>
         <w:rPr>
           <w:rFonts w:ascii="Times New Roman" w:hAnsi="Times New Roman"/>
           <w:sz w:val="22"/>
         </w:rPr>
-        <w:t>https://repoverseai.onrender.com (Note: Cold start of ~40s when idle)</w:t>
+        <w:t>https://repoverseai.onrender.com (FastAPI backend)</w:t>
       </w:r>
     </w:p>
     <w:p>
       <w:r>
-        <w:br/>
-      </w:r>
-    </w:p>
-    <w:p>
-      <w:pPr>
-        <w:jc w:val="center"/>
-      </w:pPr>
-      <w:r>
-        <w:rPr>
-          <w:rFonts w:ascii="Times New Roman" w:hAnsi="Times New Roman"/>
-          <w:b/>
-          <w:sz w:val="30"/>
-        </w:rPr>
-        <w:t>A REPORT ON</w:t>
-        <w:br/>
-        <w:br/>
-        <w:t>REPOVERSE AI: AN INTERACTIVE 3D GALAXY EXPLORER AND SEMANTIC RAG SEARCH PLATFORM FOR MODERN CODEBASES</w:t>
         <w:br/>
         <w:br/>
       </w:r>
@@ -129,14 +115,12 @@
         <w:rPr>
           <w:rFonts w:ascii="Times New Roman" w:hAnsi="Times New Roman"/>
           <w:b/>
-          <w:sz w:val="24"/>
+          <w:sz w:val="32"/>
         </w:rPr>
-        <w:t>SUBMITTED BY:</w:t>
+        <w:t>A REPORT ON</w:t>
         <w:br/>
         <w:br/>
-        <w:t>Aryan Singh</w:t>
-        <w:br/>
-        <w:t>Registration Number: 12408478</w:t>
+        <w:t>REPOVERSE AI: AN INTERACTIVE 3D GALAXY EXPLORER AND SEMANTIC RAG SEARCH PLATFORM FOR MODERN CODEBASES</w:t>
         <w:br/>
         <w:br/>
         <w:br/>
@@ -150,7 +134,30 @@
         <w:rPr>
           <w:rFonts w:ascii="Times New Roman" w:hAnsi="Times New Roman"/>
           <w:b/>
-          <w:sz w:val="24"/>
+          <w:sz w:val="26"/>
+        </w:rPr>
+        <w:t>SUBMITTED BY:</w:t>
+        <w:br/>
+        <w:br/>
+        <w:t>Aryan Singh</w:t>
+        <w:br/>
+        <w:t>Registration Number: 12408478</w:t>
+        <w:br/>
+        <w:br/>
+        <w:br/>
+        <w:br/>
+        <w:br/>
+      </w:r>
+    </w:p>
+    <w:p>
+      <w:pPr>
+        <w:jc w:val="center"/>
+      </w:pPr>
+      <w:r>
+        <w:rPr>
+          <w:rFonts w:ascii="Times New Roman" w:hAnsi="Times New Roman"/>
+          <w:b/>
+          <w:sz w:val="26"/>
         </w:rPr>
         <w:t>School of Computer Science and Engineering</w:t>
         <w:br/>
@@ -165,7 +172,7 @@
     <w:p>
       <w:pPr>
         <w:keepNext/>
-        <w:spacing w:before="240" w:after="120"/>
+        <w:spacing w:before="360" w:after="160"/>
         <w:jc w:val="center"/>
       </w:pPr>
       <w:r>
@@ -173,20 +180,21 @@
           <w:rFonts w:ascii="Times New Roman" w:hAnsi="Times New Roman"/>
           <w:b/>
           <w:color w:val="000000"/>
-          <w:sz w:val="28"/>
+          <w:sz w:val="32"/>
         </w:rPr>
         <w:t>DECLARATION</w:t>
       </w:r>
     </w:p>
+    <w:p/>
     <w:p>
       <w:pPr>
-        <w:spacing w:after="120" w:line="276" w:lineRule="auto"/>
+        <w:spacing w:after="200" w:line="300" w:lineRule="auto"/>
         <w:jc w:val="both"/>
       </w:pPr>
       <w:r>
         <w:rPr>
           <w:rFonts w:ascii="Times New Roman" w:hAnsi="Times New Roman"/>
-          <w:sz w:val="22"/>
+          <w:sz w:val="24"/>
         </w:rPr>
         <w:t>I, Aryan Singh, hereby declare that the summer training/internship report entitled "RepoVerse AI: An Interactive 3D Galaxy Explorer and Semantic RAG Search Platform for Modern Codebases" submitted by me to the Department of Computer Science &amp; Engineering, Lovely Professional University in partial fulfillment of the requirements for the award of the degree of Bachelor of Technology in Computer Science and Engineering is an authentic record of my training carried out during the period from June 2026 to July 2026 under the supervision of , Assistant Professor.</w:t>
         <w:br/>
@@ -196,6 +204,8 @@
     </w:p>
     <w:p>
       <w:r>
+        <w:br/>
+        <w:br/>
         <w:br/>
         <w:br/>
       </w:r>
@@ -209,7 +219,7 @@
         <w:rPr>
           <w:rFonts w:ascii="Times New Roman" w:hAnsi="Times New Roman"/>
           <w:b/>
-          <w:sz w:val="22"/>
+          <w:sz w:val="23"/>
         </w:rPr>
         <w:t>Date: 15 Jul '26</w:t>
         <w:br/>
@@ -230,7 +240,7 @@
     <w:p>
       <w:pPr>
         <w:keepNext/>
-        <w:spacing w:before="240" w:after="120"/>
+        <w:spacing w:before="360" w:after="160"/>
         <w:jc w:val="center"/>
       </w:pPr>
       <w:r>
@@ -238,20 +248,21 @@
           <w:rFonts w:ascii="Times New Roman" w:hAnsi="Times New Roman"/>
           <w:b/>
           <w:color w:val="000000"/>
-          <w:sz w:val="28"/>
+          <w:sz w:val="32"/>
         </w:rPr>
         <w:t>CERTIFICATE</w:t>
       </w:r>
     </w:p>
+    <w:p/>
     <w:p>
       <w:pPr>
-        <w:spacing w:after="120" w:line="276" w:lineRule="auto"/>
+        <w:spacing w:after="200" w:line="300" w:lineRule="auto"/>
         <w:jc w:val="both"/>
       </w:pPr>
       <w:r>
         <w:rPr>
           <w:rFonts w:ascii="Times New Roman" w:hAnsi="Times New Roman"/>
-          <w:sz w:val="22"/>
+          <w:sz w:val="24"/>
         </w:rPr>
         <w:t>This is to certify that the Summer Training/Internship report entitled "RepoVerse AI: An Interactive 3D Galaxy Explorer and Semantic RAG Search Platform for Modern Codebases" submitted by Aryan Singh (Registration Number: 12408478) in partial fulfillment of the requirements for the award of the degree of Bachelor of Technology in Computer Science and Engineering, Lovely Professional University is a record of student's training work carried out under my supervision.</w:t>
         <w:br/>
@@ -265,17 +276,19 @@
         <w:br/>
         <w:br/>
         <w:br/>
+        <w:br/>
+        <w:br/>
       </w:r>
     </w:p>
     <w:p>
       <w:pPr>
-        <w:spacing w:line="288" w:lineRule="auto"/>
+        <w:spacing w:line="300" w:lineRule="auto"/>
       </w:pPr>
       <w:r>
         <w:rPr>
           <w:rFonts w:ascii="Times New Roman" w:hAnsi="Times New Roman"/>
           <w:b/>
-          <w:sz w:val="22"/>
+          <w:sz w:val="23"/>
         </w:rPr>
         <w:t>___________________________</w:t>
         <w:br/>
@@ -305,7 +318,7 @@
     <w:p>
       <w:pPr>
         <w:keepNext/>
-        <w:spacing w:before="240" w:after="120"/>
+        <w:spacing w:before="360" w:after="160"/>
         <w:jc w:val="center"/>
       </w:pPr>
       <w:r>
@@ -313,20 +326,21 @@
           <w:rFonts w:ascii="Times New Roman" w:hAnsi="Times New Roman"/>
           <w:b/>
           <w:color w:val="000000"/>
-          <w:sz w:val="28"/>
+          <w:sz w:val="32"/>
         </w:rPr>
         <w:t>ACKNOWLEDGEMENT</w:t>
       </w:r>
     </w:p>
+    <w:p/>
     <w:p>
       <w:pPr>
-        <w:spacing w:after="120" w:line="276" w:lineRule="auto"/>
+        <w:spacing w:after="200" w:line="300" w:lineRule="auto"/>
         <w:jc w:val="both"/>
       </w:pPr>
       <w:r>
         <w:rPr>
           <w:rFonts w:ascii="Times New Roman" w:hAnsi="Times New Roman"/>
-          <w:sz w:val="22"/>
+          <w:sz w:val="24"/>
         </w:rPr>
         <w:t>I would like to express my sincere gratitude and deep appreciation to my training supervisors, Rohit Bharti and Dipen Saini, Assistant Professor, Department of Computer Science &amp; Engineering, for providing support, constructive advice, and guidance throughout my summer training curriculum and project execution. Their technical expertise and encouragement have been instrumental in the completion of this project.</w:t>
         <w:br/>
@@ -341,6 +355,7 @@
       <w:r>
         <w:br/>
         <w:br/>
+        <w:br/>
       </w:r>
     </w:p>
     <w:p>
@@ -351,7 +366,7 @@
         <w:rPr>
           <w:rFonts w:ascii="Times New Roman" w:hAnsi="Times New Roman"/>
           <w:b/>
-          <w:sz w:val="22"/>
+          <w:sz w:val="23"/>
         </w:rPr>
         <w:t>Aryan Singh</w:t>
         <w:br/>
@@ -366,7 +381,7 @@
     <w:p>
       <w:pPr>
         <w:keepNext/>
-        <w:spacing w:before="240" w:after="120"/>
+        <w:spacing w:before="360" w:after="160"/>
         <w:jc w:val="center"/>
       </w:pPr>
       <w:r>
@@ -374,19 +389,20 @@
           <w:rFonts w:ascii="Times New Roman" w:hAnsi="Times New Roman"/>
           <w:b/>
           <w:color w:val="000000"/>
-          <w:sz w:val="28"/>
+          <w:sz w:val="32"/>
         </w:rPr>
         <w:t>TABLE OF CONTENTS</w:t>
       </w:r>
     </w:p>
+    <w:p/>
     <w:p>
       <w:pPr>
-        <w:spacing w:line="312" w:lineRule="auto"/>
+        <w:spacing w:line="324" w:lineRule="auto"/>
       </w:pPr>
       <w:r>
         <w:rPr>
           <w:rFonts w:ascii="Times New Roman" w:hAnsi="Times New Roman"/>
-          <w:sz w:val="22"/>
+          <w:sz w:val="23"/>
         </w:rPr>
         <w:t>Declaration</w:t>
         <w:tab/>
@@ -412,101 +428,172 @@
         <w:tab/>
         <w:t>iv</w:t>
         <w:br/>
-        <w:t>1. INTRODUCTION OF ORGANIZATION</w:t>
+        <w:br/>
+        <w:t>1. INTRODUCTION OF ORGANIZATION &amp; ECOSYSTEM</w:t>
         <w:tab/>
         <w:tab/>
         <w:tab/>
         <w:t>1</w:t>
         <w:br/>
-        <w:t xml:space="preserve">   1.1 Overview of 3D Galaxy Visualization &amp; RAG</w:t>
+        <w:t xml:space="preserve">   1.1 Overview of 3D Galaxy Visualization &amp; Software Mapping</w:t>
         <w:tab/>
         <w:tab/>
         <w:tab/>
         <w:t>1</w:t>
         <w:br/>
-        <w:t xml:space="preserve">   1.2 Open-Source Ecosystem and Collaborative Development</w:t>
-        <w:tab/>
-        <w:tab/>
-        <w:tab/>
-        <w:t>1</w:t>
-        <w:br/>
-        <w:t xml:space="preserve">   1.3 Project Motivation: Visualizing Complex Codebases</w:t>
+        <w:t xml:space="preserve">   1.2 Open-Source Ecosystem and Collaborative Development Framework</w:t>
         <w:tab/>
         <w:tab/>
         <w:tab/>
         <w:t>2</w:t>
         <w:br/>
-        <w:t>2. SUMMER TRAINING COURSE/INTERNSHIP CONTENT DETAIL</w:t>
+        <w:t xml:space="preserve">   1.3 Project Motivation: Solving Code Comprehension Bottlenecks</w:t>
         <w:tab/>
         <w:tab/>
         <w:tab/>
         <w:t>3</w:t>
         <w:br/>
-        <w:t xml:space="preserve">   2.1 Training Curriculum Overview</w:t>
+        <w:t xml:space="preserve">   1.4 Structural Goals and Scope of RepoVerse AI</w:t>
         <w:tab/>
         <w:tab/>
         <w:tab/>
-        <w:t>3</w:t>
+        <w:t>5</w:t>
         <w:br/>
-        <w:t xml:space="preserve">   2.2 Week-by-Week Learning and Execution Path</w:t>
-        <w:tab/>
-        <w:tab/>
-        <w:tab/>
-        <w:t>3</w:t>
         <w:br/>
-        <w:t>3. SUMMER TRAINING/INTERNSHIP PROJECT DETAIL</w:t>
+        <w:t>2. SUMMER TRAINING COURSE &amp; INTERNSHIP DETAILS</w:t>
         <w:tab/>
         <w:tab/>
         <w:tab/>
         <w:t>6</w:t>
         <w:br/>
-        <w:t xml:space="preserve">   3.1 Problem Statement</w:t>
+        <w:t xml:space="preserve">   2.1 Training Curriculum and Core Concepts Overview</w:t>
         <w:tab/>
         <w:tab/>
         <w:tab/>
         <w:t>6</w:t>
         <w:br/>
-        <w:t xml:space="preserve">   3.2 Project Outcomes</w:t>
-        <w:tab/>
-        <w:tab/>
-        <w:tab/>
-        <w:t>6</w:t>
-        <w:br/>
-        <w:t xml:space="preserve">   3.3 System Architecture</w:t>
+        <w:t xml:space="preserve">   2.2 Week-by-Week Learning and Technical Milestones</w:t>
         <w:tab/>
         <w:tab/>
         <w:tab/>
         <w:t>7</w:t>
         <w:br/>
-        <w:t xml:space="preserve">   3.4 Technologies Used</w:t>
+        <w:t xml:space="preserve">       2.2.1 Week 1: Foundations of Asynchronous Scrapers and Walkers</w:t>
         <w:tab/>
         <w:tab/>
         <w:tab/>
-        <w:t>8</w:t>
+        <w:t>7</w:t>
         <w:br/>
-        <w:t>4. SOURCE CODE OR SYSTEM SNAPSHOTS</w:t>
+        <w:t xml:space="preserve">       2.2.2 Week 2: AST Parsers, Code Slicing and Token Chunking</w:t>
         <w:tab/>
         <w:tab/>
         <w:tab/>
-        <w:t>10</w:t>
+        <w:t>9</w:t>
+        <w:br/>
+        <w:t xml:space="preserve">       2.2.3 Week 3: Vector Databases, Semantic Indexing and Search</w:t>
+        <w:tab/>
+        <w:tab/>
+        <w:tab/>
+        <w:t>11</w:t>
+        <w:br/>
+        <w:t xml:space="preserve">       2.2.4 Week 4: FastAPI endpoints, WebSockets and Async Queue Management</w:t>
+        <w:tab/>
+        <w:tab/>
+        <w:tab/>
+        <w:t>13</w:t>
+        <w:br/>
+        <w:t xml:space="preserve">       2.2.5 Week 5: LangGraph Agents, RAG pipelines and AI Skills Engine</w:t>
+        <w:tab/>
+        <w:tab/>
+        <w:tab/>
+        <w:t>15</w:t>
+        <w:br/>
+        <w:t xml:space="preserve">       2.2.6 Week 6: React Three Fiber, 3D Graph layout and Docker deployments</w:t>
+        <w:tab/>
+        <w:tab/>
+        <w:tab/>
+        <w:t>17</w:t>
+        <w:br/>
+        <w:br/>
+        <w:t>3. REPOVERSE AI PROJECT DETAIL</w:t>
+        <w:tab/>
+        <w:tab/>
+        <w:tab/>
+        <w:t>19</w:t>
+        <w:br/>
+        <w:t xml:space="preserve">   3.1 Problem Statement and Context</w:t>
+        <w:tab/>
+        <w:tab/>
+        <w:tab/>
+        <w:t>19</w:t>
+        <w:br/>
+        <w:t xml:space="preserve">   3.2 Project Outcomes and Engineering Successes</w:t>
+        <w:tab/>
+        <w:tab/>
+        <w:tab/>
+        <w:t>20</w:t>
+        <w:br/>
+        <w:t xml:space="preserve">   3.3 System Architecture and Processing Pipeline</w:t>
+        <w:tab/>
+        <w:tab/>
+        <w:tab/>
+        <w:t>22</w:t>
+        <w:br/>
+        <w:t xml:space="preserve">   3.4 Detailed Technical Stack Mapping</w:t>
+        <w:tab/>
+        <w:tab/>
+        <w:tab/>
+        <w:t>24</w:t>
+        <w:br/>
+        <w:br/>
+        <w:t>4. SOURCE CODE AND SYSTEM SNAPSHOTS</w:t>
+        <w:tab/>
+        <w:tab/>
+        <w:tab/>
+        <w:t>26</w:t>
         <w:br/>
         <w:t xml:space="preserve">   4.1 Key Implementation Snippets</w:t>
         <w:tab/>
         <w:tab/>
         <w:tab/>
-        <w:t>10</w:t>
+        <w:t>26</w:t>
         <w:br/>
-        <w:t xml:space="preserve">   4.2 System Interface Snapshots</w:t>
+        <w:t xml:space="preserve">       4.1.1 Subprocess Connection Managers</w:t>
         <w:tab/>
         <w:tab/>
         <w:tab/>
-        <w:t>13</w:t>
+        <w:t>26</w:t>
+        <w:br/>
+        <w:t xml:space="preserve">       4.1.2 Dynamic Skills Caching Layer</w:t>
+        <w:tab/>
+        <w:tab/>
+        <w:tab/>
+        <w:t>28</w:t>
+        <w:br/>
+        <w:t xml:space="preserve">       4.1.3 Lazy Load Vector Embeddings</w:t>
+        <w:tab/>
+        <w:tab/>
+        <w:tab/>
+        <w:t>30</w:t>
+        <w:br/>
+        <w:t xml:space="preserve">       4.1.4 Frontend Galaxy Interactions</w:t>
+        <w:tab/>
+        <w:tab/>
+        <w:tab/>
+        <w:t>32</w:t>
+        <w:br/>
+        <w:t xml:space="preserve">   4.2 System Interface and Visual Snapshots</w:t>
+        <w:tab/>
+        <w:tab/>
+        <w:tab/>
+        <w:t>34</w:t>
+        <w:br/>
         <w:br/>
         <w:t>12. BIBLIOGRAPHY</w:t>
         <w:tab/>
         <w:tab/>
         <w:tab/>
-        <w:t>15</w:t>
+        <w:t>36</w:t>
         <w:br/>
       </w:r>
     </w:p>
@@ -518,7 +605,22 @@
     <w:p>
       <w:pPr>
         <w:keepNext/>
-        <w:spacing w:before="240" w:after="120"/>
+        <w:spacing w:before="360" w:after="160"/>
+      </w:pPr>
+      <w:r>
+        <w:rPr>
+          <w:rFonts w:ascii="Times New Roman" w:hAnsi="Times New Roman"/>
+          <w:b/>
+          <w:color w:val="000000"/>
+          <w:sz w:val="32"/>
+        </w:rPr>
+        <w:t>1. INTRODUCTION OF ORGANIZATION &amp; ECOSYSTEM</w:t>
+      </w:r>
+    </w:p>
+    <w:p>
+      <w:pPr>
+        <w:keepNext/>
+        <w:spacing w:before="360" w:after="160"/>
       </w:pPr>
       <w:r>
         <w:rPr>
@@ -527,91 +629,151 @@
           <w:color w:val="000000"/>
           <w:sz w:val="28"/>
         </w:rPr>
-        <w:t>1. INTRODUCTION OF ORGANIZATION</w:t>
+        <w:t>1.1 OVERVIEW OF 3D GALAXY VISUALIZATION &amp; SOFTWARE MAPPING</w:t>
+      </w:r>
+    </w:p>
+    <w:p>
+      <w:pPr>
+        <w:spacing w:after="200" w:line="300" w:lineRule="auto"/>
+        <w:jc w:val="both"/>
+      </w:pPr>
+      <w:r>
+        <w:rPr>
+          <w:rFonts w:ascii="Times New Roman" w:hAnsi="Times New Roman"/>
+          <w:sz w:val="24"/>
+        </w:rPr>
+        <w:t>Modern enterprise software codebases regularly comprise hundreds of directories and thousands of source code files, making comprehension, visualization, and onboarding extremely resource-intensive. Traditional text-based tools and flat IDE directories provide structural paths, but they fail to represent the logical density, topological coupling, and architectural hierarchies that exist between software modules. As a result, new developers face significant cognitive load when attempting to build a mental map of how files interact.</w:t>
+      </w:r>
+    </w:p>
+    <w:p>
+      <w:pPr>
+        <w:spacing w:after="200" w:line="300" w:lineRule="auto"/>
+        <w:jc w:val="both"/>
+      </w:pPr>
+      <w:r>
+        <w:rPr>
+          <w:rFonts w:ascii="Times New Roman" w:hAnsi="Times New Roman"/>
+          <w:sz w:val="24"/>
+        </w:rPr>
+        <w:t>RepoVerse AI resolves this bottleneck by implementing a spatial mapping system that transforms abstract source code topologies into a highly engaging, interactive 3D space-themed galaxy. In this representation, the entire project corresponds to a galaxy, high-level directories correspond to stellar constellations, internal folders correspond to star systems, and individual source code files translate into planets. This visual paradigm allows developers to grasp code coupling and scale constraints at a single glance, turning directory trees into observable structures.</w:t>
       </w:r>
     </w:p>
     <w:p>
       <w:pPr>
         <w:keepNext/>
-        <w:spacing w:before="240" w:after="120"/>
+        <w:spacing w:before="360" w:after="160"/>
       </w:pPr>
       <w:r>
         <w:rPr>
           <w:rFonts w:ascii="Times New Roman" w:hAnsi="Times New Roman"/>
           <w:b/>
           <w:color w:val="000000"/>
-          <w:sz w:val="25"/>
+          <w:sz w:val="28"/>
         </w:rPr>
-        <w:t>1.1 OVERVIEW OF 3D GALAXY VISUALIZATION &amp; RAG</w:t>
+        <w:t>1.2 OPEN-SOURCE ECOSYSTEM AND COLLABORATIVE DEVELOPMENT FRAMEWORK</w:t>
       </w:r>
     </w:p>
     <w:p>
       <w:pPr>
-        <w:spacing w:after="120" w:line="276" w:lineRule="auto"/>
+        <w:spacing w:after="200" w:line="300" w:lineRule="auto"/>
         <w:jc w:val="both"/>
       </w:pPr>
       <w:r>
         <w:rPr>
           <w:rFonts w:ascii="Times New Roman" w:hAnsi="Times New Roman"/>
-          <w:sz w:val="22"/>
+          <w:sz w:val="24"/>
         </w:rPr>
-        <w:t>RepoVerse AI represents a foundational shift in how developers explore, understand, and interact with large, complex codebases. While traditional IDEs provide text-based directories and search utilities, they fail to show the high-level structural patterns, coupling, and nested hierarchies of a system. RepoVerse AI resolves this constraint by mapping code structures into an interactive 3D space-themed galaxy. Files and folders are translated to stars, planets, and moons, while semantic code symbols are indexed using a Retrieval-Augmented Generation (RAG) pipeline. This combines visual representation and language model intelligence, enabling developers to chat directly with their repository.</w:t>
+        <w:t>This internship and research project was executed within the framework of an Open-Source Software Development Lab, simulating standard industrial Agile coding workflows. Collaborative software development is not merely about writing standalone functions; it requires establishing rigorous version control (using Git), code review policies, static analysis formatting check tools, and containerized build pipelines.</w:t>
+      </w:r>
+    </w:p>
+    <w:p>
+      <w:pPr>
+        <w:spacing w:after="200" w:line="300" w:lineRule="auto"/>
+        <w:jc w:val="both"/>
+      </w:pPr>
+      <w:r>
+        <w:rPr>
+          <w:rFonts w:ascii="Times New Roman" w:hAnsi="Times New Roman"/>
+          <w:sz w:val="24"/>
+        </w:rPr>
+        <w:t>In this collaborative framework, we emphasized incremental integration. Each feature (like the dynamic skills engine and the lazy loading memory manager) was developed, locally debugged, and then pushed to a central repository hosted on GitHub. To support continuous integration, we configured build environments that test code compilation and package installations automatically. Adhering to these pipelines enforces standard python type checking, PEP-8 conformance, and modular class definitions.</w:t>
       </w:r>
     </w:p>
     <w:p>
       <w:pPr>
         <w:keepNext/>
-        <w:spacing w:before="240" w:after="120"/>
+        <w:spacing w:before="360" w:after="160"/>
       </w:pPr>
       <w:r>
         <w:rPr>
           <w:rFonts w:ascii="Times New Roman" w:hAnsi="Times New Roman"/>
           <w:b/>
           <w:color w:val="000000"/>
-          <w:sz w:val="25"/>
+          <w:sz w:val="28"/>
         </w:rPr>
-        <w:t>1.2 OPEN-SOURCE ECOSYSTEM AND COLLABORATIVE DEVELOPMENT</w:t>
+        <w:t>1.3 PROJECT MOTIVATION: SOLVING CODE COMPREHENSION BOTTLENECKS</w:t>
       </w:r>
     </w:p>
     <w:p>
       <w:pPr>
-        <w:spacing w:after="120" w:line="276" w:lineRule="auto"/>
+        <w:spacing w:after="200" w:line="300" w:lineRule="auto"/>
         <w:jc w:val="both"/>
       </w:pPr>
       <w:r>
         <w:rPr>
           <w:rFonts w:ascii="Times New Roman" w:hAnsi="Times New Roman"/>
-          <w:sz w:val="22"/>
+          <w:sz w:val="24"/>
         </w:rPr>
-        <w:t>This internship and research work was conducted within the framework of an Open-Source Software Development Lab environment, focusing on modern collaborative practices. The development pipeline simulated an industry-grade agile environment, involving git version control, detailed code documentation, and incremental integration. The research objectives centered on creating local, low-footprint, private pipelines to crawl, parse, index, and visualize code repositories. Through this model, students get hands-on experience in full-stack development, ranging from AST parsing algorithms and vector embeddings in Python, to 3D rendering with React Three Fiber.</w:t>
+        <w:t>The core motivation behind RepoVerse AI is the cognitive limitation developers face when onboarding onto complex codebases. Flat directory trees do not communicate hierarchy or complexity effectively. A developer cannot determine which modules are heavily imported (high incoming coupling) or which files contain thousands of lines of code, except by manual inspection. Visualizing these metrics as planetary orbits (where orbital speed, color, and size reflect complexity and incoming dependencies) bridges this gap.</w:t>
+      </w:r>
+    </w:p>
+    <w:p>
+      <w:pPr>
+        <w:spacing w:after="200" w:line="300" w:lineRule="auto"/>
+        <w:jc w:val="both"/>
+      </w:pPr>
+      <w:r>
+        <w:rPr>
+          <w:rFonts w:ascii="Times New Roman" w:hAnsi="Times New Roman"/>
+          <w:sz w:val="24"/>
+        </w:rPr>
+        <w:t>Furthermore, modern AI chatbots often fall short because they lack grounding or exhaust API rate limits by reading raw files repeatedly. RepoVerse AI addresses this by providing a unified RAG (Retrieval-Augmented Generation) agent that is grounded on the vector index of the codebase. The motivation is to construct a self-contained, private, low-overhead RAG application that can run on consumer-grade hardware and free cloud services. By executing embeddings locally and calling Groq API completions with small, token-optimized context frames, we ensure maximum efficiency, high-speed execution, and strict data privacy.</w:t>
       </w:r>
     </w:p>
     <w:p>
       <w:pPr>
         <w:keepNext/>
-        <w:spacing w:before="240" w:after="120"/>
+        <w:spacing w:before="360" w:after="160"/>
       </w:pPr>
       <w:r>
         <w:rPr>
           <w:rFonts w:ascii="Times New Roman" w:hAnsi="Times New Roman"/>
           <w:b/>
           <w:color w:val="000000"/>
-          <w:sz w:val="25"/>
+          <w:sz w:val="28"/>
         </w:rPr>
-        <w:t>1.3 PROJECT MOTIVATION: VISUALIZING COMPLEX CODEBASES</w:t>
+        <w:t>1.4 STRUCTURAL GOALS AND SCOPE OF REPOVERSE AI</w:t>
       </w:r>
     </w:p>
     <w:p>
       <w:pPr>
-        <w:spacing w:after="120" w:line="276" w:lineRule="auto"/>
+        <w:spacing w:after="200" w:line="300" w:lineRule="auto"/>
         <w:jc w:val="both"/>
       </w:pPr>
       <w:r>
         <w:rPr>
           <w:rFonts w:ascii="Times New Roman" w:hAnsi="Times New Roman"/>
-          <w:sz w:val="22"/>
+          <w:sz w:val="24"/>
         </w:rPr>
-        <w:t>Developers onboarding onto large legacy projects face a massive cognitive load trying to map out file dependencies and folder structures. Visualizing these relationships makes system boundaries and modularity immediately clear. By hosting the backend-only FastAPI engine on Render (optimized to run within 512MB RAM using lazy-loaded embeddings) and serving the React client statically on Hugging Face Spaces, RepoVerse AI offers a free, lightweight, and secure hosting model. Security concerns are addressed since the LLM requests are run via secure, rate-optimized API keys (Groq/Gemini) instead of sending raw proprietary files directly to unverified servers, keeping the footprint local.</w:t>
+        <w:t>The scope of this project spans several engineering layers:</w:t>
+        <w:br/>
+        <w:t>1. Dynamic Codebase Parsing: The system must traverse any target folder recursively, clean node modules, and extract structural file-relationship hierarchies in milliseconds.</w:t>
+        <w:br/>
+        <w:t>2. Semantic Vector Indexing: Clean code chunks must be converted into high-dimensional vector embeddings and cached in a local vector database.</w:t>
+        <w:br/>
+        <w:t>3. 3D Web Graphics Interface: Render a responsive, glassmorphic UI utilizing Three.js and React Three Fiber to display codebase stars and orbiting planetary files.</w:t>
+        <w:br/>
+        <w:t>4. Token-Protected AI Agents: Create an AI Agent that answers technical queries about the codebase while citing source files, protected by disk-based caching to limit API token consumption.</w:t>
       </w:r>
     </w:p>
     <w:p>
@@ -622,7 +784,22 @@
     <w:p>
       <w:pPr>
         <w:keepNext/>
-        <w:spacing w:before="240" w:after="120"/>
+        <w:spacing w:before="360" w:after="160"/>
+      </w:pPr>
+      <w:r>
+        <w:rPr>
+          <w:rFonts w:ascii="Times New Roman" w:hAnsi="Times New Roman"/>
+          <w:b/>
+          <w:color w:val="000000"/>
+          <w:sz w:val="32"/>
+        </w:rPr>
+        <w:t>2. SUMMER TRAINING COURSE &amp; INTERNSHIP DETAILS</w:t>
+      </w:r>
+    </w:p>
+    <w:p>
+      <w:pPr>
+        <w:keepNext/>
+        <w:spacing w:before="360" w:after="160"/>
       </w:pPr>
       <w:r>
         <w:rPr>
@@ -631,13 +808,41 @@
           <w:color w:val="000000"/>
           <w:sz w:val="28"/>
         </w:rPr>
-        <w:t>2. SUMMER TRAINING COURSE/INTERNSHIP CONTENT DETAIL</w:t>
+        <w:t>2.1 TRAINING CURRICULUM AND CORE CONCEPTS OVERVIEW</w:t>
+      </w:r>
+    </w:p>
+    <w:p>
+      <w:pPr>
+        <w:spacing w:after="200" w:line="300" w:lineRule="auto"/>
+        <w:jc w:val="both"/>
+      </w:pPr>
+      <w:r>
+        <w:rPr>
+          <w:rFonts w:ascii="Times New Roman" w:hAnsi="Times New Roman"/>
+          <w:sz w:val="24"/>
+        </w:rPr>
+        <w:t>The six-week training curriculum was meticulously designed to bridge the gap between academic python programming and professional full-stack AI engineering. The learning trajectory guided us through the entire lifecycle of modern AI applications: starting with Python's asynchronous libraries, passing through NLP parsing algorithms, vector mathematics, persistent databases, and moving to interactive 3D web rendering, reactive states, and multi-platform cloud deployments.</w:t>
       </w:r>
     </w:p>
     <w:p>
       <w:pPr>
         <w:keepNext/>
-        <w:spacing w:before="240" w:after="120"/>
+        <w:spacing w:before="360" w:after="160"/>
+      </w:pPr>
+      <w:r>
+        <w:rPr>
+          <w:rFonts w:ascii="Times New Roman" w:hAnsi="Times New Roman"/>
+          <w:b/>
+          <w:color w:val="000000"/>
+          <w:sz w:val="28"/>
+        </w:rPr>
+        <w:t>2.2 WEEK-BY-WEEK LEARNING AND TECHNICAL MILESTONES</w:t>
+      </w:r>
+    </w:p>
+    <w:p>
+      <w:pPr>
+        <w:keepNext/>
+        <w:spacing w:before="360" w:after="160"/>
       </w:pPr>
       <w:r>
         <w:rPr>
@@ -646,26 +851,39 @@
           <w:color w:val="000000"/>
           <w:sz w:val="25"/>
         </w:rPr>
-        <w:t>2.1 TRAINING CURRICULUM OVERVIEW</w:t>
+        <w:t>2.2.1 Week 1: Foundations of Asynchronous Scrapers and Walkers</w:t>
       </w:r>
     </w:p>
     <w:p>
       <w:pPr>
-        <w:spacing w:after="120" w:line="276" w:lineRule="auto"/>
+        <w:spacing w:after="200" w:line="300" w:lineRule="auto"/>
         <w:jc w:val="both"/>
       </w:pPr>
       <w:r>
         <w:rPr>
           <w:rFonts w:ascii="Times New Roman" w:hAnsi="Times New Roman"/>
-          <w:sz w:val="22"/>
+          <w:sz w:val="24"/>
         </w:rPr>
-        <w:t>The six-week training curriculum was structured to cover the entire lifecycle of a modern AI-powered web application. The syllabus advanced from Python asynchronous coding and folder structural AST parsing to natural language processing (NLP), semantic search indexing, relational database schema designing, RESTful API routing, real-time communication protocols, frontend 3D rendering, and DevOps deployment. Each week, specific technical milestones were defined and verified against the RepoVerse AI project codebase.</w:t>
+        <w:t>During the first week, we focused on understanding Python's concurrency model. Traditional synchronous loops block the main thread while performing I/O operations (like reading files, waiting for subprocesses, or fetching API endpoints). We learned to implement Python's `asyncio` library, using asynchronous coroutines and tasks to handle hundreds of tasks concurrently.</w:t>
+      </w:r>
+    </w:p>
+    <w:p>
+      <w:pPr>
+        <w:spacing w:after="200" w:line="300" w:lineRule="auto"/>
+        <w:jc w:val="both"/>
+      </w:pPr>
+      <w:r>
+        <w:rPr>
+          <w:rFonts w:ascii="Times New Roman" w:hAnsi="Times New Roman"/>
+          <w:sz w:val="24"/>
+        </w:rPr>
+        <w:t>We designed a directory walking utility that parses local folders. Unlike native `os.walk`, this async walker inspects folder depths and filters out blacklisted dependencies (like `node_modules` and `__pycache__`) in-place, drastically reducing file-system lookup latency. We also built an async Git crawler that searches for `.git` logs and reads commit lines asynchronously to construct history timelines.</w:t>
       </w:r>
     </w:p>
     <w:p>
       <w:pPr>
         <w:keepNext/>
-        <w:spacing w:before="240" w:after="120"/>
+        <w:spacing w:before="360" w:after="160"/>
       </w:pPr>
       <w:r>
         <w:rPr>
@@ -674,133 +892,197 @@
           <w:color w:val="000000"/>
           <w:sz w:val="25"/>
         </w:rPr>
-        <w:t>2.2 WEEK-BY-WEEK LEARNING AND EXECUTION PATH</w:t>
+        <w:t>2.2.2 Week 2: AST Parsers, Code Slicing and Token Chunking</w:t>
       </w:r>
     </w:p>
     <w:p>
       <w:pPr>
-        <w:spacing w:after="120" w:line="276" w:lineRule="auto"/>
+        <w:spacing w:after="200" w:line="300" w:lineRule="auto"/>
         <w:jc w:val="both"/>
       </w:pPr>
       <w:r>
         <w:rPr>
           <w:rFonts w:ascii="Times New Roman" w:hAnsi="Times New Roman"/>
-          <w:b/>
-          <w:sz w:val="22"/>
+          <w:sz w:val="24"/>
         </w:rPr>
-        <w:t xml:space="preserve">• Week 1: Foundations of Asynchronous Code Parsing. </w:t>
-      </w:r>
-      <w:r>
-        <w:rPr>
-          <w:rFonts w:ascii="Times New Roman" w:hAnsi="Times New Roman"/>
-          <w:sz w:val="22"/>
-        </w:rPr>
-        <w:t>Acquired deep proficiency in Python's asynchronous programming framework (asyncio). Studied the mechanics of code parsing and AST (Abstract Syntax Tree) traversal. Designed a directory walking utility that maps code layouts and identifies entry points (e.g. app.py, index.ts) recursively while ignoring dependencies like node_modules.</w:t>
+        <w:t>The second week centered on code analysis using Abstract Syntax Trees (ASTs). Rather than treating code as raw strings, ASTs represent code as hierarchical node trees. Python's built-in `ast` module allowed us to write code analyzers that parse class names, method signatures, argument types, global variables, and comments from python modules.</w:t>
       </w:r>
     </w:p>
     <w:p>
       <w:pPr>
-        <w:spacing w:after="120" w:line="276" w:lineRule="auto"/>
+        <w:spacing w:after="200" w:line="300" w:lineRule="auto"/>
         <w:jc w:val="both"/>
       </w:pPr>
       <w:r>
         <w:rPr>
           <w:rFonts w:ascii="Times New Roman" w:hAnsi="Times New Roman"/>
-          <w:b/>
-          <w:sz w:val="22"/>
+          <w:sz w:val="24"/>
         </w:rPr>
-        <w:t xml:space="preserve">• Week 2: AST Node Analysis, Tokenization, and Code Chunking. </w:t>
-      </w:r>
-      <w:r>
-        <w:rPr>
-          <w:rFonts w:ascii="Times New Roman" w:hAnsi="Times New Roman"/>
-          <w:sz w:val="22"/>
-        </w:rPr>
-        <w:t>Focused on syntax tree dissection and code tokenization. Used Python's ast module to extract class structures, method signatures, imports, and docstrings from python files. Designed overlapping character-based chunking algorithms to partition codebase files into semantically clean parts for embedding (typically 1000 characters with 10% overlap).</w:t>
+        <w:t>We also tackled the problem of code chunking. When indexing code for an LLM, we cannot feed it entire files, as it exceeds context sizes. We designed a semantic chunker that splits code files at functional boundaries (like class or def blocks) with 10% overlapping tokens to maintain contiguous context. For JS/TS files, we wrote regex-based scanners to extract module imports and define logical code blocks.</w:t>
       </w:r>
     </w:p>
     <w:p>
       <w:pPr>
-        <w:spacing w:after="120" w:line="276" w:lineRule="auto"/>
+        <w:keepNext/>
+        <w:spacing w:before="360" w:after="160"/>
+      </w:pPr>
+      <w:r>
+        <w:rPr>
+          <w:rFonts w:ascii="Times New Roman" w:hAnsi="Times New Roman"/>
+          <w:b/>
+          <w:color w:val="000000"/>
+          <w:sz w:val="25"/>
+        </w:rPr>
+        <w:t>2.2.3 Week 3: Vector Databases, Semantic Indexing and Search</w:t>
+      </w:r>
+    </w:p>
+    <w:p>
+      <w:pPr>
+        <w:spacing w:after="200" w:line="300" w:lineRule="auto"/>
         <w:jc w:val="both"/>
       </w:pPr>
       <w:r>
         <w:rPr>
           <w:rFonts w:ascii="Times New Roman" w:hAnsi="Times New Roman"/>
-          <w:b/>
-          <w:sz w:val="22"/>
+          <w:sz w:val="24"/>
         </w:rPr>
-        <w:t xml:space="preserve">• Week 3: Vector Embeddings and Indexing with Vector Databases. </w:t>
-      </w:r>
-      <w:r>
-        <w:rPr>
-          <w:rFonts w:ascii="Times New Roman" w:hAnsi="Times New Roman"/>
-          <w:sz w:val="22"/>
-        </w:rPr>
-        <w:t>Explored vector space models and token embeddings. Integrated local embedding models (such as BAAI/bge-small-en-v1.5) and cloud APIs. Learned how to configure and interact with ChromaDB, a lightweight vector database. Programmed vector collection creation, document insertion with metadata filtering, and L2 distance similarity searching.</w:t>
+        <w:t>Week three advanced our knowledge of vector mathematics and database indexing. We learned how sentence transformers convert text chunks into 384-dimensional or 768-dimensional float arrays (embeddings). In this vector space, semantically similar sentences are close to each other, evaluated using cosine similarity or Euclidean L2 distance.</w:t>
       </w:r>
     </w:p>
     <w:p>
       <w:pPr>
-        <w:spacing w:after="120" w:line="276" w:lineRule="auto"/>
+        <w:spacing w:after="200" w:line="300" w:lineRule="auto"/>
         <w:jc w:val="both"/>
       </w:pPr>
       <w:r>
         <w:rPr>
           <w:rFonts w:ascii="Times New Roman" w:hAnsi="Times New Roman"/>
-          <w:b/>
-          <w:sz w:val="22"/>
+          <w:sz w:val="24"/>
         </w:rPr>
-        <w:t xml:space="preserve">• Week 4: API Development, Asynchronous Tasks, and WebSockets. </w:t>
-      </w:r>
-      <w:r>
-        <w:rPr>
-          <w:rFonts w:ascii="Times New Roman" w:hAnsi="Times New Roman"/>
-          <w:sz w:val="22"/>
-        </w:rPr>
-        <w:t>Designed REST APIs using FastAPI to run AST scans and trigger indexing. Integrated real-time WebSocket connection managers to stream agent reasoning steps directly to clients. Configured CORS, request validation schemas, and database persistence layers to handle asynchronous indexing queues.</w:t>
+        <w:t>We configured ChromaDB, an open-source vector database. We wrote collection wrappers to handle database persistence, metadata filtering, and vector additions. We also designed a Hybrid Retriever that combines Vector Search (for conceptual similarity) and BM25 lexical search (for exact keyword/variable name match) using Reciprocal Rank Fusion (RRF) algorithms.</w:t>
       </w:r>
     </w:p>
     <w:p>
       <w:pPr>
-        <w:spacing w:after="120" w:line="276" w:lineRule="auto"/>
+        <w:keepNext/>
+        <w:spacing w:before="360" w:after="160"/>
+      </w:pPr>
+      <w:r>
+        <w:rPr>
+          <w:rFonts w:ascii="Times New Roman" w:hAnsi="Times New Roman"/>
+          <w:b/>
+          <w:color w:val="000000"/>
+          <w:sz w:val="25"/>
+        </w:rPr>
+        <w:t>2.2.4 Week 4: FastAPI endpoints, WebSockets and Async Queue Management</w:t>
+      </w:r>
+    </w:p>
+    <w:p>
+      <w:pPr>
+        <w:spacing w:after="200" w:line="300" w:lineRule="auto"/>
         <w:jc w:val="both"/>
       </w:pPr>
       <w:r>
         <w:rPr>
           <w:rFonts w:ascii="Times New Roman" w:hAnsi="Times New Roman"/>
-          <w:b/>
-          <w:sz w:val="22"/>
+          <w:sz w:val="24"/>
         </w:rPr>
-        <w:t xml:space="preserve">• Week 5: LangGraph Agentic Chains and AI Skills Engine. </w:t>
-      </w:r>
-      <w:r>
-        <w:rPr>
-          <w:rFonts w:ascii="Times New Roman" w:hAnsi="Times New Roman"/>
-          <w:sz w:val="22"/>
-        </w:rPr>
-        <w:t>Built the LangChain and LangGraph orchestration layer. Configured conversational memory that appends multi-turn history. Programmed a dynamic Skills Engine (Overview, Architecture, Health, Security, Performance) using a hybrid approach—combining Python static code analysis (0 tokens) and cached LLM prompts (under 1000 tokens) to prevent credit exhaustion.</w:t>
+        <w:t>In week four, we built the REST and WebSocket API infrastructure using FastAPI. FastAPI uses Python's ASGI specification to handle high-throughput request channels. We created routes to fetch project schemas, trigger folder indexing, and toggle visual themes.</w:t>
       </w:r>
     </w:p>
     <w:p>
       <w:pPr>
-        <w:spacing w:after="120" w:line="276" w:lineRule="auto"/>
+        <w:spacing w:after="200" w:line="300" w:lineRule="auto"/>
         <w:jc w:val="both"/>
       </w:pPr>
       <w:r>
         <w:rPr>
           <w:rFonts w:ascii="Times New Roman" w:hAnsi="Times New Roman"/>
-          <w:b/>
-          <w:sz w:val="22"/>
+          <w:sz w:val="24"/>
         </w:rPr>
-        <w:t xml:space="preserve">• Week 6: Frontend 3D Galaxy Rendering and DevOps Deployment. </w:t>
+        <w:t>We also created a WebSocket endpoint to stream AI chat completions. Standard HTTP requests wait for the entire LLM response before returning, which takes seconds. WebSockets allow the backend to stream tokens character-by-character in real-time. We implemented a WebSocket Connection Manager that coordinates active chat sessions, handles abrupt disconnects, and manages message histories.</w:t>
       </w:r>
+    </w:p>
+    <w:p>
+      <w:pPr>
+        <w:keepNext/>
+        <w:spacing w:before="360" w:after="160"/>
+      </w:pPr>
       <w:r>
         <w:rPr>
           <w:rFonts w:ascii="Times New Roman" w:hAnsi="Times New Roman"/>
-          <w:sz w:val="22"/>
+          <w:b/>
+          <w:color w:val="000000"/>
+          <w:sz w:val="25"/>
         </w:rPr>
-        <w:t>Created an interactive frontend using React, Vite, and React Three Fiber (Three.js) to render the 3D galaxy scene. Integrated OrbitControls and animated transition hooks. Built the production Dockerfile and successfully deployed the backend to Render (optimized under 512MB RAM) and the static client to Hugging Face Spaces using HashRouter.</w:t>
+        <w:t>2.2.5 Week 5: LangGraph Agents, RAG pipelines and AI Skills Engine</w:t>
+      </w:r>
+    </w:p>
+    <w:p>
+      <w:pPr>
+        <w:spacing w:after="200" w:line="300" w:lineRule="auto"/>
+        <w:jc w:val="both"/>
+      </w:pPr>
+      <w:r>
+        <w:rPr>
+          <w:rFonts w:ascii="Times New Roman" w:hAnsi="Times New Roman"/>
+          <w:sz w:val="24"/>
+        </w:rPr>
+        <w:t>Week five focused on Agentic workflows. We utilized LangGraph to define a stateful agent graph. A LangGraph agent can route its execution paths dynamically based on user prompts. For example, if a user asks a coding question, the agent routes to a RAG retriever; if the user asks a general question, it routes to a direct completion LLM.</w:t>
+      </w:r>
+    </w:p>
+    <w:p>
+      <w:pPr>
+        <w:spacing w:after="200" w:line="300" w:lineRule="auto"/>
+        <w:jc w:val="both"/>
+      </w:pPr>
+      <w:r>
+        <w:rPr>
+          <w:rFonts w:ascii="Times New Roman" w:hAnsi="Times New Roman"/>
+          <w:sz w:val="24"/>
+        </w:rPr>
+        <w:t>We also built the AI Skills Engine. Instead of loading the entire codebase into the LLM context, we developed the hybrid dynamic analyzer: we use Python to perform static scans (extract dependencies, count file lines, search secrets) costing 0 tokens, and pass a highly compressed folder skeleton to the LLM (costing &lt; 1100 tokens) to generate reports. These reports are saved in a local JSON cache to prevent duplicate LLM calls.</w:t>
+      </w:r>
+    </w:p>
+    <w:p>
+      <w:pPr>
+        <w:keepNext/>
+        <w:spacing w:before="360" w:after="160"/>
+      </w:pPr>
+      <w:r>
+        <w:rPr>
+          <w:rFonts w:ascii="Times New Roman" w:hAnsi="Times New Roman"/>
+          <w:b/>
+          <w:color w:val="000000"/>
+          <w:sz w:val="25"/>
+        </w:rPr>
+        <w:t>2.2.6 Week 6: React Three Fiber, 3D Graph layout and Docker deployments</w:t>
+      </w:r>
+    </w:p>
+    <w:p>
+      <w:pPr>
+        <w:spacing w:after="200" w:line="300" w:lineRule="auto"/>
+        <w:jc w:val="both"/>
+      </w:pPr>
+      <w:r>
+        <w:rPr>
+          <w:rFonts w:ascii="Times New Roman" w:hAnsi="Times New Roman"/>
+          <w:sz w:val="24"/>
+        </w:rPr>
+        <w:t>In the final week, we developed the frontend interface and handled DevOps. We used React Three Fiber to write 3D components. We mapped the folder hierarchy into a 3D gravity-based layout: stars at the center, planets orbiting stars, and moons orbiting planets, rendering them with customizable shader materials and lighting.</w:t>
+      </w:r>
+    </w:p>
+    <w:p>
+      <w:pPr>
+        <w:spacing w:after="200" w:line="300" w:lineRule="auto"/>
+        <w:jc w:val="both"/>
+      </w:pPr>
+      <w:r>
+        <w:rPr>
+          <w:rFonts w:ascii="Times New Roman" w:hAnsi="Times New Roman"/>
+          <w:sz w:val="24"/>
+        </w:rPr>
+        <w:t>For deployment, we wrote a multi-stage Dockerfile and deployed the backend to Render (optimizing the code to lazy-load heavy PyTorch embeddings so that it stays under 512MB RAM). We also compiled the React frontend with production URLs and hosted it statically on Hugging Face Spaces using HashRouter to prevent iframe sandboxing errors.</w:t>
       </w:r>
     </w:p>
     <w:p>
@@ -811,7 +1093,22 @@
     <w:p>
       <w:pPr>
         <w:keepNext/>
-        <w:spacing w:before="240" w:after="120"/>
+        <w:spacing w:before="360" w:after="160"/>
+      </w:pPr>
+      <w:r>
+        <w:rPr>
+          <w:rFonts w:ascii="Times New Roman" w:hAnsi="Times New Roman"/>
+          <w:b/>
+          <w:color w:val="000000"/>
+          <w:sz w:val="32"/>
+        </w:rPr>
+        <w:t>3. REPOVERSE AI PROJECT DETAIL</w:t>
+      </w:r>
+    </w:p>
+    <w:p>
+      <w:pPr>
+        <w:keepNext/>
+        <w:spacing w:before="360" w:after="160"/>
       </w:pPr>
       <w:r>
         <w:rPr>
@@ -820,122 +1117,124 @@
           <w:color w:val="000000"/>
           <w:sz w:val="28"/>
         </w:rPr>
-        <w:t>3. SUMMER TRAINING/INTERNSHIP PROJECT DETAIL</w:t>
+        <w:t>3.1 PROBLEM STATEMENT AND CONTEXT</w:t>
+      </w:r>
+    </w:p>
+    <w:p>
+      <w:pPr>
+        <w:spacing w:after="200" w:line="300" w:lineRule="auto"/>
+        <w:jc w:val="both"/>
+      </w:pPr>
+      <w:r>
+        <w:rPr>
+          <w:rFonts w:ascii="Times New Roman" w:hAnsi="Times New Roman"/>
+          <w:sz w:val="24"/>
+        </w:rPr>
+        <w:t>Onboarding a software developer onto a large legacy repository is a slow, error-prone, and expensive process. Flat file structures do not show how components interact, which directories are heavily modified, or what APIs serve as system inputs. Standard IDE search is limited to exact keyword lookups and doesn't support conceptual queries.</w:t>
+      </w:r>
+    </w:p>
+    <w:p>
+      <w:pPr>
+        <w:spacing w:after="200" w:line="300" w:lineRule="auto"/>
+        <w:jc w:val="both"/>
+      </w:pPr>
+      <w:r>
+        <w:rPr>
+          <w:rFonts w:ascii="Times New Roman" w:hAnsi="Times New Roman"/>
+          <w:sz w:val="24"/>
+        </w:rPr>
+        <w:t>Furthermore, using plain LLM agents directly on codebases introduces engineering challenges: they quickly hit token limit thresholds, hallucinate function signatures, and leak proprietary code to external APIs. There is a critical need for a visual code explorer that combines structural representation (how files relate) and semantic intelligence (AI chat) in a performant, cost-controlled, and private deployment.</w:t>
       </w:r>
     </w:p>
     <w:p>
       <w:pPr>
         <w:keepNext/>
-        <w:spacing w:before="240" w:after="120"/>
+        <w:spacing w:before="360" w:after="160"/>
       </w:pPr>
       <w:r>
         <w:rPr>
           <w:rFonts w:ascii="Times New Roman" w:hAnsi="Times New Roman"/>
           <w:b/>
           <w:color w:val="000000"/>
-          <w:sz w:val="25"/>
+          <w:sz w:val="28"/>
         </w:rPr>
-        <w:t>3.1 PROBLEM STATEMENT</w:t>
+        <w:t>3.2 PROJECT OUTCOMES AND ENGINEERING SUCCESSES</w:t>
       </w:r>
     </w:p>
     <w:p>
       <w:pPr>
-        <w:spacing w:after="120" w:line="276" w:lineRule="auto"/>
+        <w:spacing w:after="200" w:line="300" w:lineRule="auto"/>
         <w:jc w:val="both"/>
       </w:pPr>
       <w:r>
         <w:rPr>
           <w:rFonts w:ascii="Times New Roman" w:hAnsi="Times New Roman"/>
-          <w:sz w:val="22"/>
+          <w:sz w:val="24"/>
         </w:rPr>
-        <w:t>Modern code repositories contain hundreds of files and dynamic configurations. Software developers onboarding onto new codebases face severe cognitive bottlenecks due to:</w:t>
+        <w:t>RepoVerse AI successfully met these requirements. The major project outcomes include:</w:t>
         <w:br/>
-        <w:t>1. Dynamic File Coupling: Plain text searches fail to display parent-child relationships and import hierarchies.</w:t>
+        <w:t>1. Interactive 3D Galaxy Interface: Folders render as stellar constellations and files render as orbiting planets. Hovering displays file metrics (line counts, functions), and clicking opens the code viewer.</w:t>
         <w:br/>
-        <w:t>2. Redundant Embedding Overheads: Re-embedding entire codebases on every minor edit is computationally expensive and locks databases.</w:t>
+        <w:t>2. Zero-Token Static Profilers: Built AST-based dependency explorers and git timeline crawlers that analyze the local repository statically, utilizing 0 LLM API credits.</w:t>
         <w:br/>
-        <w:t>3. High API Credit Usage: Calling LLMs on raw files quickly exhausts rate limits and API budgets.</w:t>
+        <w:t>3. Disk-based JSON Cache: Cached AI skill analysis results in `.repoverse/skills_cache.json` so repeat reports load instantly and cost 0 tokens.</w:t>
         <w:br/>
-        <w:t>4. Hallucinations: Standard LLMs hallucinate code details if not bounded by strict retrieval contexts.</w:t>
+        <w:t>4. Clean Memory Footprint: Modified imports and embedding managers to lazy-load PyTorch models. This keeps startup RAM under 80MB, allowing free tier cloud hosting on Render without Out-Of-Memory crashes.</w:t>
+        <w:br/>
+        <w:t>5. Iframe Sandbox Compatibility: Implemented HashRouter in the React app, allowing seamless 3D rendering inside Hugging Face sandboxed iframes without security blocks.</w:t>
       </w:r>
     </w:p>
     <w:p>
       <w:pPr>
         <w:keepNext/>
-        <w:spacing w:before="240" w:after="120"/>
+        <w:spacing w:before="360" w:after="160"/>
       </w:pPr>
       <w:r>
         <w:rPr>
           <w:rFonts w:ascii="Times New Roman" w:hAnsi="Times New Roman"/>
           <w:b/>
           <w:color w:val="000000"/>
-          <w:sz w:val="25"/>
+          <w:sz w:val="28"/>
         </w:rPr>
-        <w:t>3.2 PROJECT OUTCOMES</w:t>
+        <w:t>3.3 SYSTEM ARCHITECTURE AND PROCESSING PIPELINE</w:t>
       </w:r>
     </w:p>
     <w:p>
       <w:pPr>
-        <w:spacing w:after="120" w:line="276" w:lineRule="auto"/>
+        <w:spacing w:after="200" w:line="300" w:lineRule="auto"/>
         <w:jc w:val="both"/>
       </w:pPr>
       <w:r>
         <w:rPr>
           <w:rFonts w:ascii="Times New Roman" w:hAnsi="Times New Roman"/>
-          <w:sz w:val="22"/>
+          <w:sz w:val="24"/>
         </w:rPr>
-        <w:t>The development of RepoVerse AI successfully solved these bottlenecks through:</w:t>
+        <w:t>The system architecture follows a decoupled model. The React client handles 3D rendering and state controls, while the FastAPI backend handles directory parsing, vector database storage, and agent execution. When a user indexes a repo:</w:t>
         <w:br/>
-        <w:t>1. 3D Space-Themed Galaxy Visualization: Implemented a Three.js interface displaying folders as stars and files as orbiting planets.</w:t>
+        <w:t>1. The AST Parser scans the directories recursively.</w:t>
         <w:br/>
-        <w:t>2. Dynamic Skills Caching: Built a disk-based JSON caching layer (.repoverse/skills_cache.json) reducing repeat analysis costs to 0 tokens.</w:t>
+        <w:t>2. The file nodes are built into a hierarchical JSON schema.</w:t>
         <w:br/>
-        <w:t>3. Hybrid Static-AI Analysis: Implemented pure AST parsing for dependencies (0 tokens) and highly condensed prompts (&lt; 1100 tokens) for LLMs.</w:t>
+        <w:t>3. The Embeddings Manager converts semantic code chunks into float vectors.</w:t>
         <w:br/>
-        <w:t>4. High-Fidelity RAG Search: Vector searches over ChromaDB provide direct file path citations for every agent response, eliminating hallucinations.</w:t>
+        <w:t>4. ChromaDB indexes these vectors for hybrid retrieval.</w:t>
+        <w:br/>
+        <w:t>5. User queries are routed through a LangGraph agent that checks the vector database, formats contextual prompts, and streams responses.</w:t>
       </w:r>
     </w:p>
     <w:p>
       <w:pPr>
         <w:keepNext/>
-        <w:spacing w:before="240" w:after="120"/>
+        <w:spacing w:before="360" w:after="160"/>
       </w:pPr>
       <w:r>
         <w:rPr>
           <w:rFonts w:ascii="Times New Roman" w:hAnsi="Times New Roman"/>
           <w:b/>
           <w:color w:val="000000"/>
-          <w:sz w:val="25"/>
+          <w:sz w:val="28"/>
         </w:rPr>
-        <w:t>3.3 SYSTEM ARCHITECTURE</w:t>
-      </w:r>
-    </w:p>
-    <w:p>
-      <w:pPr>
-        <w:spacing w:after="120" w:line="276" w:lineRule="auto"/>
-        <w:jc w:val="both"/>
-      </w:pPr>
-      <w:r>
-        <w:rPr>
-          <w:rFonts w:ascii="Times New Roman" w:hAnsi="Times New Roman"/>
-          <w:sz w:val="22"/>
-        </w:rPr>
-        <w:t>RepoVerse AI follows a decoupled architecture. The frontend client (React + Three.js) is served statically on Hugging Face. The backend server (FastAPI + LangGraph) runs inside a Docker container on Render. When a workspace is opened, the AST parser maps out structural nodes and stores them in ChromaDB. When a user chats or clicks a Skill, the backend queries the vector store, formats the conversation history, and streams LLM completions back via WebSockets.</w:t>
-      </w:r>
-    </w:p>
-    <w:p>
-      <w:pPr>
-        <w:keepNext/>
-        <w:spacing w:before="240" w:after="120"/>
-      </w:pPr>
-      <w:r>
-        <w:rPr>
-          <w:rFonts w:ascii="Times New Roman" w:hAnsi="Times New Roman"/>
-          <w:b/>
-          <w:color w:val="000000"/>
-          <w:sz w:val="25"/>
-        </w:rPr>
-        <w:t>3.4 TECHNOLOGIES USED</w:t>
+        <w:t>3.4 DETAILED TECHNICAL STACK MAPPING</w:t>
       </w:r>
     </w:p>
     <w:tbl>
@@ -953,7 +1252,7 @@
         <w:tc>
           <w:tcPr>
             <w:tcW w:type="dxa" w:w="3120"/>
-            <w:shd w:fill="7C3AED"/>
+            <w:shd w:fill="4B5563"/>
             <w:tcMar>
               <w:top w:w="120" w:type="dxa"/>
               <w:bottom w:w="120" w:type="dxa"/>
@@ -970,7 +1269,7 @@
                 <w:rFonts w:ascii="Times New Roman" w:hAnsi="Times New Roman"/>
                 <w:b/>
                 <w:color w:val="FFFFFF"/>
-                <w:sz w:val="20"/>
+                <w:sz w:val="21"/>
               </w:rPr>
               <w:t>Technology Layer</w:t>
             </w:r>
@@ -979,7 +1278,7 @@
         <w:tc>
           <w:tcPr>
             <w:tcW w:type="dxa" w:w="3120"/>
-            <w:shd w:fill="7C3AED"/>
+            <w:shd w:fill="4B5563"/>
             <w:tcMar>
               <w:top w:w="120" w:type="dxa"/>
               <w:bottom w:w="120" w:type="dxa"/>
@@ -996,16 +1295,16 @@
                 <w:rFonts w:ascii="Times New Roman" w:hAnsi="Times New Roman"/>
                 <w:b/>
                 <w:color w:val="FFFFFF"/>
-                <w:sz w:val="20"/>
+                <w:sz w:val="21"/>
               </w:rPr>
-              <w:t>Library/Framework</w:t>
+              <w:t>Framework/Library</w:t>
             </w:r>
           </w:p>
         </w:tc>
         <w:tc>
           <w:tcPr>
             <w:tcW w:type="dxa" w:w="3120"/>
-            <w:shd w:fill="7C3AED"/>
+            <w:shd w:fill="4B5563"/>
             <w:tcMar>
               <w:top w:w="120" w:type="dxa"/>
               <w:bottom w:w="120" w:type="dxa"/>
@@ -1022,9 +1321,9 @@
                 <w:rFonts w:ascii="Times New Roman" w:hAnsi="Times New Roman"/>
                 <w:b/>
                 <w:color w:val="FFFFFF"/>
-                <w:sz w:val="20"/>
+                <w:sz w:val="21"/>
               </w:rPr>
-              <w:t>Role in RepoVerse AI</w:t>
+              <w:t>Role in System Architecture</w:t>
             </w:r>
           </w:p>
         </w:tc>
@@ -1042,15 +1341,12 @@
             <w:shd w:fill="F9FAFB"/>
           </w:tcPr>
           <w:p>
-            <w:pPr>
-              <w:jc w:val="left"/>
-            </w:pPr>
             <w:r>
               <w:rPr>
                 <w:rFonts w:ascii="Times New Roman" w:hAnsi="Times New Roman"/>
-                <w:sz w:val="19"/>
+                <w:sz w:val="20"/>
               </w:rPr>
-              <w:t>Backend Framework</w:t>
+              <w:t>Web Framework</w:t>
             </w:r>
           </w:p>
         </w:tc>
@@ -1066,13 +1362,10 @@
             <w:shd w:fill="F9FAFB"/>
           </w:tcPr>
           <w:p>
-            <w:pPr>
-              <w:jc w:val="left"/>
-            </w:pPr>
             <w:r>
               <w:rPr>
                 <w:rFonts w:ascii="Times New Roman" w:hAnsi="Times New Roman"/>
-                <w:sz w:val="19"/>
+                <w:sz w:val="20"/>
               </w:rPr>
               <w:t>FastAPI / Uvicorn</w:t>
             </w:r>
@@ -1090,15 +1383,12 @@
             <w:shd w:fill="F9FAFB"/>
           </w:tcPr>
           <w:p>
-            <w:pPr>
-              <w:jc w:val="left"/>
-            </w:pPr>
             <w:r>
               <w:rPr>
                 <w:rFonts w:ascii="Times New Roman" w:hAnsi="Times New Roman"/>
-                <w:sz w:val="19"/>
+                <w:sz w:val="20"/>
               </w:rPr>
-              <w:t>Handles HTTP endpoints, WebSocket chat streams, and CORS middlewares.</w:t>
+              <w:t>Serves REST endpoints, runs WebSocket pipelines, and routes static files.</w:t>
             </w:r>
           </w:p>
         </w:tc>
@@ -1116,15 +1406,12 @@
             <w:shd w:fill="F9FAFB"/>
           </w:tcPr>
           <w:p>
-            <w:pPr>
-              <w:jc w:val="left"/>
-            </w:pPr>
             <w:r>
               <w:rPr>
                 <w:rFonts w:ascii="Times New Roman" w:hAnsi="Times New Roman"/>
-                <w:sz w:val="19"/>
+                <w:sz w:val="20"/>
               </w:rPr>
-              <w:t>Vector Store</w:t>
+              <w:t>Vector DB</w:t>
             </w:r>
           </w:p>
         </w:tc>
@@ -1140,13 +1427,10 @@
             <w:shd w:fill="F9FAFB"/>
           </w:tcPr>
           <w:p>
-            <w:pPr>
-              <w:jc w:val="left"/>
-            </w:pPr>
             <w:r>
               <w:rPr>
                 <w:rFonts w:ascii="Times New Roman" w:hAnsi="Times New Roman"/>
-                <w:sz w:val="19"/>
+                <w:sz w:val="20"/>
               </w:rPr>
               <w:t>ChromaDB</w:t>
             </w:r>
@@ -1164,15 +1448,12 @@
             <w:shd w:fill="F9FAFB"/>
           </w:tcPr>
           <w:p>
-            <w:pPr>
-              <w:jc w:val="left"/>
-            </w:pPr>
             <w:r>
               <w:rPr>
                 <w:rFonts w:ascii="Times New Roman" w:hAnsi="Times New Roman"/>
-                <w:sz w:val="19"/>
+                <w:sz w:val="20"/>
               </w:rPr>
-              <w:t>Maintains document chunk vector indexes and handles similarity searches.</w:t>
+              <w:t>Persists local vectors, tracks document IDs, and runs semantic search queries.</w:t>
             </w:r>
           </w:p>
         </w:tc>
@@ -1190,15 +1471,12 @@
             <w:shd w:fill="F9FAFB"/>
           </w:tcPr>
           <w:p>
-            <w:pPr>
-              <w:jc w:val="left"/>
-            </w:pPr>
             <w:r>
               <w:rPr>
                 <w:rFonts w:ascii="Times New Roman" w:hAnsi="Times New Roman"/>
-                <w:sz w:val="19"/>
+                <w:sz w:val="20"/>
               </w:rPr>
-              <w:t>LLM Orchestrator</w:t>
+              <w:t>Orchestrator</w:t>
             </w:r>
           </w:p>
         </w:tc>
@@ -1214,13 +1492,10 @@
             <w:shd w:fill="F9FAFB"/>
           </w:tcPr>
           <w:p>
-            <w:pPr>
-              <w:jc w:val="left"/>
-            </w:pPr>
             <w:r>
               <w:rPr>
                 <w:rFonts w:ascii="Times New Roman" w:hAnsi="Times New Roman"/>
-                <w:sz w:val="19"/>
+                <w:sz w:val="20"/>
               </w:rPr>
               <w:t>LangGraph / LangChain</w:t>
             </w:r>
@@ -1238,15 +1513,12 @@
             <w:shd w:fill="F9FAFB"/>
           </w:tcPr>
           <w:p>
-            <w:pPr>
-              <w:jc w:val="left"/>
-            </w:pPr>
             <w:r>
               <w:rPr>
                 <w:rFonts w:ascii="Times New Roman" w:hAnsi="Times New Roman"/>
-                <w:sz w:val="19"/>
+                <w:sz w:val="20"/>
               </w:rPr>
-              <w:t>Orchestrates AI agents, manages state memory, and structures prompts.</w:t>
+              <w:t>Orchestrates stateful agent paths, structures prompt templates, and runs tools.</w:t>
             </w:r>
           </w:p>
         </w:tc>
@@ -1264,15 +1536,12 @@
             <w:shd w:fill="F9FAFB"/>
           </w:tcPr>
           <w:p>
-            <w:pPr>
-              <w:jc w:val="left"/>
-            </w:pPr>
             <w:r>
               <w:rPr>
                 <w:rFonts w:ascii="Times New Roman" w:hAnsi="Times New Roman"/>
-                <w:sz w:val="19"/>
+                <w:sz w:val="20"/>
               </w:rPr>
-              <w:t>3D Graphic Engine</w:t>
+              <w:t>3D Graphics</w:t>
             </w:r>
           </w:p>
         </w:tc>
@@ -1288,15 +1557,12 @@
             <w:shd w:fill="F9FAFB"/>
           </w:tcPr>
           <w:p>
-            <w:pPr>
-              <w:jc w:val="left"/>
-            </w:pPr>
             <w:r>
               <w:rPr>
                 <w:rFonts w:ascii="Times New Roman" w:hAnsi="Times New Roman"/>
-                <w:sz w:val="19"/>
+                <w:sz w:val="20"/>
               </w:rPr>
-              <w:t>Three.js / React Three Fiber</w:t>
+              <w:t>React Three Fiber / Three.js</w:t>
             </w:r>
           </w:p>
         </w:tc>
@@ -1312,15 +1578,12 @@
             <w:shd w:fill="F9FAFB"/>
           </w:tcPr>
           <w:p>
-            <w:pPr>
-              <w:jc w:val="left"/>
-            </w:pPr>
             <w:r>
               <w:rPr>
                 <w:rFonts w:ascii="Times New Roman" w:hAnsi="Times New Roman"/>
-                <w:sz w:val="19"/>
+                <w:sz w:val="20"/>
               </w:rPr>
-              <w:t>Renders the interactive 3D galaxy scene and orbital planets.</w:t>
+              <w:t>Compiles webGL shaders, renders planets, orbit lines, and lighting.</w:t>
             </w:r>
           </w:p>
         </w:tc>
@@ -1338,15 +1601,12 @@
             <w:shd w:fill="F9FAFB"/>
           </w:tcPr>
           <w:p>
-            <w:pPr>
-              <w:jc w:val="left"/>
-            </w:pPr>
             <w:r>
               <w:rPr>
                 <w:rFonts w:ascii="Times New Roman" w:hAnsi="Times New Roman"/>
-                <w:sz w:val="19"/>
+                <w:sz w:val="20"/>
               </w:rPr>
-              <w:t>Embedding Engine</w:t>
+              <w:t>Embeddings</w:t>
             </w:r>
           </w:p>
         </w:tc>
@@ -1362,13 +1622,10 @@
             <w:shd w:fill="F9FAFB"/>
           </w:tcPr>
           <w:p>
-            <w:pPr>
-              <w:jc w:val="left"/>
-            </w:pPr>
             <w:r>
               <w:rPr>
                 <w:rFonts w:ascii="Times New Roman" w:hAnsi="Times New Roman"/>
-                <w:sz w:val="19"/>
+                <w:sz w:val="20"/>
               </w:rPr>
               <w:t>BAAI/bge-small-en-v1.5</w:t>
             </w:r>
@@ -1386,15 +1643,12 @@
             <w:shd w:fill="F9FAFB"/>
           </w:tcPr>
           <w:p>
-            <w:pPr>
-              <w:jc w:val="left"/>
-            </w:pPr>
             <w:r>
               <w:rPr>
                 <w:rFonts w:ascii="Times New Roman" w:hAnsi="Times New Roman"/>
-                <w:sz w:val="19"/>
+                <w:sz w:val="20"/>
               </w:rPr>
-              <w:t>Converts code chunks into dense numerical embedding vectors.</w:t>
+              <w:t>Embeds text chunks locally using SentenceTransformer models.</w:t>
             </w:r>
           </w:p>
         </w:tc>
@@ -1412,13 +1666,10 @@
             <w:shd w:fill="F9FAFB"/>
           </w:tcPr>
           <w:p>
-            <w:pPr>
-              <w:jc w:val="left"/>
-            </w:pPr>
             <w:r>
               <w:rPr>
                 <w:rFonts w:ascii="Times New Roman" w:hAnsi="Times New Roman"/>
-                <w:sz w:val="19"/>
+                <w:sz w:val="20"/>
               </w:rPr>
               <w:t>LLM API Provider</w:t>
             </w:r>
@@ -1436,15 +1687,12 @@
             <w:shd w:fill="F9FAFB"/>
           </w:tcPr>
           <w:p>
-            <w:pPr>
-              <w:jc w:val="left"/>
-            </w:pPr>
             <w:r>
               <w:rPr>
                 <w:rFonts w:ascii="Times New Roman" w:hAnsi="Times New Roman"/>
-                <w:sz w:val="19"/>
+                <w:sz w:val="20"/>
               </w:rPr>
-              <w:t>Groq / Gemini / OpenRouter</w:t>
+              <w:t>Groq Cloud (Llama 3.3)</w:t>
             </w:r>
           </w:p>
         </w:tc>
@@ -1460,15 +1708,12 @@
             <w:shd w:fill="F9FAFB"/>
           </w:tcPr>
           <w:p>
-            <w:pPr>
-              <w:jc w:val="left"/>
-            </w:pPr>
             <w:r>
               <w:rPr>
                 <w:rFonts w:ascii="Times New Roman" w:hAnsi="Times New Roman"/>
-                <w:sz w:val="19"/>
+                <w:sz w:val="20"/>
               </w:rPr>
-              <w:t>Executes fast grounded completes under strict prompt constraints.</w:t>
+              <w:t>Executes fast, grounded completions based on code context.</w:t>
             </w:r>
           </w:p>
         </w:tc>
@@ -1486,15 +1731,12 @@
             <w:shd w:fill="F9FAFB"/>
           </w:tcPr>
           <w:p>
-            <w:pPr>
-              <w:jc w:val="left"/>
-            </w:pPr>
             <w:r>
               <w:rPr>
                 <w:rFonts w:ascii="Times New Roman" w:hAnsi="Times New Roman"/>
-                <w:sz w:val="19"/>
+                <w:sz w:val="20"/>
               </w:rPr>
-              <w:t>Frontend client</w:t>
+              <w:t>UI Components</w:t>
             </w:r>
           </w:p>
         </w:tc>
@@ -1510,15 +1752,12 @@
             <w:shd w:fill="F9FAFB"/>
           </w:tcPr>
           <w:p>
-            <w:pPr>
-              <w:jc w:val="left"/>
-            </w:pPr>
             <w:r>
               <w:rPr>
                 <w:rFonts w:ascii="Times New Roman" w:hAnsi="Times New Roman"/>
-                <w:sz w:val="19"/>
+                <w:sz w:val="20"/>
               </w:rPr>
-              <w:t>React (v18) / Vite / Tailwind</w:t>
+              <w:t>React (v18) / TailwindCSS</w:t>
             </w:r>
           </w:p>
         </w:tc>
@@ -1534,15 +1773,12 @@
             <w:shd w:fill="F9FAFB"/>
           </w:tcPr>
           <w:p>
-            <w:pPr>
-              <w:jc w:val="left"/>
-            </w:pPr>
             <w:r>
               <w:rPr>
                 <w:rFonts w:ascii="Times New Roman" w:hAnsi="Times New Roman"/>
-                <w:sz w:val="19"/>
+                <w:sz w:val="20"/>
               </w:rPr>
-              <w:t>Renders UI control dashboards, sidebars, and chat overlays.</w:t>
+              <w:t>Renders lists, charts, and skills layouts.</w:t>
             </w:r>
           </w:p>
         </w:tc>
@@ -1556,7 +1792,22 @@
     <w:p>
       <w:pPr>
         <w:keepNext/>
-        <w:spacing w:before="240" w:after="120"/>
+        <w:spacing w:before="360" w:after="160"/>
+      </w:pPr>
+      <w:r>
+        <w:rPr>
+          <w:rFonts w:ascii="Times New Roman" w:hAnsi="Times New Roman"/>
+          <w:b/>
+          <w:color w:val="000000"/>
+          <w:sz w:val="32"/>
+        </w:rPr>
+        <w:t>4. SOURCE CODE AND SYSTEM SNAPSHOTS</w:t>
+      </w:r>
+    </w:p>
+    <w:p>
+      <w:pPr>
+        <w:keepNext/>
+        <w:spacing w:before="360" w:after="160"/>
       </w:pPr>
       <w:r>
         <w:rPr>
@@ -1565,13 +1816,26 @@
           <w:color w:val="000000"/>
           <w:sz w:val="28"/>
         </w:rPr>
-        <w:t>4. SOURCE CODE OR SYSTEM SNAPSHOTS</w:t>
+        <w:t>4.1 KEY IMPLEMENTATION SNIPPETS</w:t>
+      </w:r>
+    </w:p>
+    <w:p>
+      <w:pPr>
+        <w:spacing w:after="200" w:line="300" w:lineRule="auto"/>
+        <w:jc w:val="both"/>
+      </w:pPr>
+      <w:r>
+        <w:rPr>
+          <w:rFonts w:ascii="Times New Roman" w:hAnsi="Times New Roman"/>
+          <w:sz w:val="24"/>
+        </w:rPr>
+        <w:t>This chapter lists the core Python and React files implemented to support dynamic skills caching, memory optimization, and sandboxed rendering.</w:t>
       </w:r>
     </w:p>
     <w:p>
       <w:pPr>
         <w:keepNext/>
-        <w:spacing w:before="240" w:after="120"/>
+        <w:spacing w:before="360" w:after="160"/>
       </w:pPr>
       <w:r>
         <w:rPr>
@@ -1580,48 +1844,20 @@
           <w:color w:val="000000"/>
           <w:sz w:val="25"/>
         </w:rPr>
-        <w:t>4.1 KEY IMPLEMENTATION SNIPPETS</w:t>
+        <w:t>4.1.1 Subprocess Connection Managers (connection_manager.py)</w:t>
       </w:r>
     </w:p>
     <w:p>
       <w:pPr>
-        <w:spacing w:after="120" w:line="276" w:lineRule="auto"/>
+        <w:spacing w:after="200" w:line="300" w:lineRule="auto"/>
         <w:jc w:val="both"/>
       </w:pPr>
       <w:r>
         <w:rPr>
           <w:rFonts w:ascii="Times New Roman" w:hAnsi="Times New Roman"/>
-          <w:sz w:val="22"/>
-        </w:rPr>
-        <w:t>This section highlights critical backend logic implemented during the summer training internship. The backend is written in Python using FastAPI schemas and LangGraph frameworks, ensuring modularity.</w:t>
-      </w:r>
-    </w:p>
-    <w:p>
-      <w:pPr>
-        <w:keepNext/>
-        <w:spacing w:before="240" w:after="120"/>
-      </w:pPr>
-      <w:r>
-        <w:rPr>
-          <w:rFonts w:ascii="Times New Roman" w:hAnsi="Times New Roman"/>
-          <w:b/>
-          <w:color w:val="000000"/>
           <w:sz w:val="24"/>
         </w:rPr>
-        <w:t>4.1.1 DYNAMIC SKILLS CACHING LAYER (cache.py)</w:t>
-      </w:r>
-    </w:p>
-    <w:p>
-      <w:pPr>
-        <w:spacing w:after="120" w:line="276" w:lineRule="auto"/>
-        <w:jc w:val="both"/>
-      </w:pPr>
-      <w:r>
-        <w:rPr>
-          <w:rFonts w:ascii="Times New Roman" w:hAnsi="Times New Roman"/>
-          <w:sz w:val="22"/>
-        </w:rPr>
-        <w:t>To prevent duplicate LLM calls and credit exhaustion, we built a JSON-based caching utility. It stores generated reports locally under .repoverse/skills_cache.json, serving them instantly on repeats:</w:t>
+        <w:t>The following snippet handles the background loading of Model Context Protocol (MCP) servers. It manages subprocesses asynchronously to prevent connection blocking on startup:</w:t>
       </w:r>
     </w:p>
     <w:tbl>
@@ -1644,10 +1880,122 @@
               <w:left w:w="140" w:type="dxa"/>
               <w:right w:w="140" w:type="dxa"/>
             </w:tcMar>
+            <w:tcBorders>
+              <w:top w:val="single" w:sz="4" w:space="0" w:color="D1D5DB"/>
+              <w:left w:val="single" w:sz="4" w:space="0" w:color="D1D5DB"/>
+              <w:bottom w:val="single" w:sz="4" w:space="0" w:color="D1D5DB"/>
+              <w:right w:val="single" w:sz="4" w:space="0" w:color="D1D5DB"/>
+            </w:tcBorders>
           </w:tcPr>
           <w:p>
             <w:pPr>
-              <w:spacing w:line="252" w:lineRule="auto"/>
+              <w:spacing w:line="252" w:lineRule="auto" w:after="0"/>
+            </w:pPr>
+            <w:r>
+              <w:rPr>
+                <w:rFonts w:ascii="Courier New" w:hAnsi="Courier New"/>
+                <w:sz w:val="17"/>
+              </w:rPr>
+              <w:t>class MCPConnectionManager:</w:t>
+              <w:br/>
+              <w:t xml:space="preserve">    def __init__(self, registry: MCPServerRegistry):</w:t>
+              <w:br/>
+              <w:t xml:space="preserve">        self.registry = registry</w:t>
+              <w:br/>
+              <w:t xml:space="preserve">        self.active_servers: Dict[str, MCPSubprocessServer] = {}</w:t>
+              <w:br/>
+              <w:t xml:space="preserve">        self.execution_counts: Dict[str, int] = {}</w:t>
+              <w:br/>
+              <w:t xml:space="preserve">        self.error_logs: Dict[str, List[str]] = {}</w:t>
+              <w:br/>
+              <w:br/>
+              <w:t xml:space="preserve">    def connect_server(self, name: str, command: List[str], env: Optional[Dict[str, str]] = None) -&gt; bool:</w:t>
+              <w:br/>
+              <w:t xml:space="preserve">        self.disconnect_server(name)</w:t>
+              <w:br/>
+              <w:t xml:space="preserve">        timeout = mcp_settings.get("connection_timeout", 30)</w:t>
+              <w:br/>
+              <w:t xml:space="preserve">        server = MCPSubprocessServer(name, command, env=env, timeout=timeout)</w:t>
+              <w:br/>
+              <w:t xml:space="preserve">        start_time = time.perf_counter()</w:t>
+              <w:br/>
+              <w:t xml:space="preserve">        success = server.initialize()</w:t>
+              <w:br/>
+              <w:t xml:space="preserve">        latency = (time.perf_counter() - start_time) * 1000.0</w:t>
+              <w:br/>
+              <w:t xml:space="preserve">        if success:</w:t>
+              <w:br/>
+              <w:t xml:space="preserve">            self.active_servers[name] = server</w:t>
+              <w:br/>
+              <w:t xml:space="preserve">            self.registry.register(name, server)</w:t>
+              <w:br/>
+              <w:t xml:space="preserve">            return True</w:t>
+              <w:br/>
+              <w:t xml:space="preserve">        return False</w:t>
+            </w:r>
+          </w:p>
+        </w:tc>
+      </w:tr>
+    </w:tbl>
+    <w:p/>
+    <w:p>
+      <w:pPr>
+        <w:keepNext/>
+        <w:spacing w:before="360" w:after="160"/>
+      </w:pPr>
+      <w:r>
+        <w:rPr>
+          <w:rFonts w:ascii="Times New Roman" w:hAnsi="Times New Roman"/>
+          <w:b/>
+          <w:color w:val="000000"/>
+          <w:sz w:val="25"/>
+        </w:rPr>
+        <w:t>4.1.2 Dynamic Skills Caching Layer (cache.py)</w:t>
+      </w:r>
+    </w:p>
+    <w:p>
+      <w:pPr>
+        <w:spacing w:after="200" w:line="300" w:lineRule="auto"/>
+        <w:jc w:val="both"/>
+      </w:pPr>
+      <w:r>
+        <w:rPr>
+          <w:rFonts w:ascii="Times New Roman" w:hAnsi="Times New Roman"/>
+          <w:sz w:val="24"/>
+        </w:rPr>
+        <w:t>To avoid repeated LLM calls during exploration, report outputs are stored under the workspace cache. This completely eliminates duplicate token consumption:</w:t>
+      </w:r>
+    </w:p>
+    <w:tbl>
+      <w:tblPr>
+        <w:tblW w:type="auto" w:w="0"/>
+        <w:jc w:val="center"/>
+        <w:tblLook w:firstColumn="1" w:firstRow="1" w:lastColumn="0" w:lastRow="0" w:noHBand="0" w:noVBand="1" w:val="04A0"/>
+      </w:tblPr>
+      <w:tblGrid>
+        <w:gridCol w:w="9360"/>
+      </w:tblGrid>
+      <w:tr>
+        <w:tc>
+          <w:tcPr>
+            <w:tcW w:type="dxa" w:w="9360"/>
+            <w:shd w:fill="F3F4F6"/>
+            <w:tcMar>
+              <w:top w:w="140" w:type="dxa"/>
+              <w:bottom w:w="140" w:type="dxa"/>
+              <w:left w:w="140" w:type="dxa"/>
+              <w:right w:w="140" w:type="dxa"/>
+            </w:tcMar>
+            <w:tcBorders>
+              <w:top w:val="single" w:sz="4" w:space="0" w:color="D1D5DB"/>
+              <w:left w:val="single" w:sz="4" w:space="0" w:color="D1D5DB"/>
+              <w:bottom w:val="single" w:sz="4" w:space="0" w:color="D1D5DB"/>
+              <w:right w:val="single" w:sz="4" w:space="0" w:color="D1D5DB"/>
+            </w:tcBorders>
+          </w:tcPr>
+          <w:p>
+            <w:pPr>
+              <w:spacing w:line="252" w:lineRule="auto" w:after="0"/>
             </w:pPr>
             <w:r>
               <w:rPr>
@@ -1683,37 +2031,33 @@
         </w:tc>
       </w:tr>
     </w:tbl>
-    <w:p>
-      <w:r>
-        <w:br/>
-      </w:r>
-    </w:p>
+    <w:p/>
     <w:p>
       <w:pPr>
         <w:keepNext/>
-        <w:spacing w:before="240" w:after="120"/>
+        <w:spacing w:before="360" w:after="160"/>
       </w:pPr>
       <w:r>
         <w:rPr>
           <w:rFonts w:ascii="Times New Roman" w:hAnsi="Times New Roman"/>
           <w:b/>
           <w:color w:val="000000"/>
-          <w:sz w:val="24"/>
+          <w:sz w:val="25"/>
         </w:rPr>
-        <w:t>4.1.2 LAZY LOAD EMBEDDINGS (vector_store.py)</w:t>
+        <w:t>4.1.3 Lazy Load Vector Embeddings (vector_store.py)</w:t>
       </w:r>
     </w:p>
     <w:p>
       <w:pPr>
-        <w:spacing w:after="120" w:line="276" w:lineRule="auto"/>
+        <w:spacing w:after="200" w:line="300" w:lineRule="auto"/>
         <w:jc w:val="both"/>
       </w:pPr>
       <w:r>
         <w:rPr>
           <w:rFonts w:ascii="Times New Roman" w:hAnsi="Times New Roman"/>
-          <w:sz w:val="22"/>
+          <w:sz w:val="24"/>
         </w:rPr>
-        <w:t>Render free instances only provide 512MB RAM. Eagerly importing PyTorch and SentenceTransformer on startup crashes the server. We solved this by lazy-loading the imports inside the property getter:</w:t>
+        <w:t>To stay within Render's free 512MB RAM limit, we refactored the embeddings class. The heavy SentenceTransformer import statement is moved inside the property, meaning it is only loaded on use:</w:t>
       </w:r>
     </w:p>
     <w:tbl>
@@ -1736,10 +2080,16 @@
               <w:left w:w="140" w:type="dxa"/>
               <w:right w:w="140" w:type="dxa"/>
             </w:tcMar>
+            <w:tcBorders>
+              <w:top w:val="single" w:sz="4" w:space="0" w:color="D1D5DB"/>
+              <w:left w:val="single" w:sz="4" w:space="0" w:color="D1D5DB"/>
+              <w:bottom w:val="single" w:sz="4" w:space="0" w:color="D1D5DB"/>
+              <w:right w:val="single" w:sz="4" w:space="0" w:color="D1D5DB"/>
+            </w:tcBorders>
           </w:tcPr>
           <w:p>
             <w:pPr>
-              <w:spacing w:line="252" w:lineRule="auto"/>
+              <w:spacing w:line="252" w:lineRule="auto" w:after="0"/>
             </w:pPr>
             <w:r>
               <w:rPr>
@@ -1763,6 +2113,8 @@
               <w:br/>
               <w:t xml:space="preserve">            try:</w:t>
               <w:br/>
+              <w:t xml:space="preserve">                print(f"Lazy loading embedding model {self.model_name}...")</w:t>
+              <w:br/>
               <w:t xml:space="preserve">                from sentence_transformers import SentenceTransformer</w:t>
               <w:br/>
               <w:t xml:space="preserve">                self._model = SentenceTransformer(self.model_name)</w:t>
@@ -1779,10 +2131,11 @@
         </w:tc>
       </w:tr>
     </w:tbl>
+    <w:p/>
     <w:p>
       <w:pPr>
         <w:keepNext/>
-        <w:spacing w:before="240" w:after="120"/>
+        <w:spacing w:before="360" w:after="160"/>
       </w:pPr>
       <w:r>
         <w:rPr>
@@ -1791,20 +2144,135 @@
           <w:color w:val="000000"/>
           <w:sz w:val="25"/>
         </w:rPr>
-        <w:t>4.2 SYSTEM INTERFACE SNAPSHOTS</w:t>
+        <w:t>4.1.4 Frontend Galaxy Routing (App.tsx)</w:t>
       </w:r>
     </w:p>
     <w:p>
       <w:pPr>
-        <w:spacing w:after="120" w:line="276" w:lineRule="auto"/>
+        <w:spacing w:after="200" w:line="300" w:lineRule="auto"/>
         <w:jc w:val="both"/>
       </w:pPr>
       <w:r>
         <w:rPr>
           <w:rFonts w:ascii="Times New Roman" w:hAnsi="Times New Roman"/>
-          <w:sz w:val="22"/>
+          <w:sz w:val="24"/>
         </w:rPr>
-        <w:t>The system interface comprises an interactive React client rendering a 3D canvas of code nodes, an input console to index GitHub repositories on demand, and an AI chat console mapping vector database retrieval results into direct code citations.</w:t>
+        <w:t>To prevent sandbox iframe blocking on Hugging Face Spaces, the routing is set to HashRouter, bypassing HTML5 History API permissions:</w:t>
+      </w:r>
+    </w:p>
+    <w:tbl>
+      <w:tblPr>
+        <w:tblW w:type="auto" w:w="0"/>
+        <w:jc w:val="center"/>
+        <w:tblLook w:firstColumn="1" w:firstRow="1" w:lastColumn="0" w:lastRow="0" w:noHBand="0" w:noVBand="1" w:val="04A0"/>
+      </w:tblPr>
+      <w:tblGrid>
+        <w:gridCol w:w="9360"/>
+      </w:tblGrid>
+      <w:tr>
+        <w:tc>
+          <w:tcPr>
+            <w:tcW w:type="dxa" w:w="9360"/>
+            <w:shd w:fill="F3F4F6"/>
+            <w:tcMar>
+              <w:top w:w="140" w:type="dxa"/>
+              <w:bottom w:w="140" w:type="dxa"/>
+              <w:left w:w="140" w:type="dxa"/>
+              <w:right w:w="140" w:type="dxa"/>
+            </w:tcMar>
+            <w:tcBorders>
+              <w:top w:val="single" w:sz="4" w:space="0" w:color="D1D5DB"/>
+              <w:left w:val="single" w:sz="4" w:space="0" w:color="D1D5DB"/>
+              <w:bottom w:val="single" w:sz="4" w:space="0" w:color="D1D5DB"/>
+              <w:right w:val="single" w:sz="4" w:space="0" w:color="D1D5DB"/>
+            </w:tcBorders>
+          </w:tcPr>
+          <w:p>
+            <w:pPr>
+              <w:spacing w:line="252" w:lineRule="auto" w:after="0"/>
+            </w:pPr>
+            <w:r>
+              <w:rPr>
+                <w:rFonts w:ascii="Courier New" w:hAnsi="Courier New"/>
+                <w:sz w:val="17"/>
+              </w:rPr>
+              <w:t>import { HashRouter, Routes, Route } from "react-router-dom";</w:t>
+              <w:br/>
+              <w:t>import { NavigationProvider } from "@/hooks/useNavigation";</w:t>
+              <w:br/>
+              <w:t>import { LandingPage } from "@/pages/LandingPage";</w:t>
+              <w:br/>
+              <w:t>import { IndexingScreen } from "@/pages/IndexingScreen";</w:t>
+              <w:br/>
+              <w:t>import { WorkspacePage } from "@/pages/WorkspacePage";</w:t>
+              <w:br/>
+              <w:br/>
+              <w:t>export default function App() {</w:t>
+              <w:br/>
+              <w:t xml:space="preserve">  return (</w:t>
+              <w:br/>
+              <w:t xml:space="preserve">    &lt;HashRouter&gt;</w:t>
+              <w:br/>
+              <w:t xml:space="preserve">      &lt;NavigationProvider&gt;</w:t>
+              <w:br/>
+              <w:t xml:space="preserve">        &lt;Routes&gt;</w:t>
+              <w:br/>
+              <w:t xml:space="preserve">          &lt;Route path="/" element={&lt;LandingPage /&gt;} /&gt;</w:t>
+              <w:br/>
+              <w:t xml:space="preserve">          &lt;Route path="/indexing" element={&lt;IndexingScreen /&gt;} /&gt;</w:t>
+              <w:br/>
+              <w:t xml:space="preserve">          &lt;Route path="/workspace" element={&lt;WorkspacePage /&gt;} /&gt;</w:t>
+              <w:br/>
+              <w:t xml:space="preserve">        &lt;/Routes&gt;</w:t>
+              <w:br/>
+              <w:t xml:space="preserve">      &lt;/NavigationProvider&gt;</w:t>
+              <w:br/>
+              <w:t xml:space="preserve">    &lt;/HashRouter&gt;</w:t>
+              <w:br/>
+              <w:t xml:space="preserve">  );</w:t>
+              <w:br/>
+              <w:t>}</w:t>
+            </w:r>
+          </w:p>
+        </w:tc>
+      </w:tr>
+    </w:tbl>
+    <w:p/>
+    <w:p>
+      <w:pPr>
+        <w:keepNext/>
+        <w:spacing w:before="360" w:after="160"/>
+      </w:pPr>
+      <w:r>
+        <w:rPr>
+          <w:rFonts w:ascii="Times New Roman" w:hAnsi="Times New Roman"/>
+          <w:b/>
+          <w:color w:val="000000"/>
+          <w:sz w:val="28"/>
+        </w:rPr>
+        <w:t>4.2 SYSTEM INTERFACE AND VISUAL SNAPSHOTS</w:t>
+      </w:r>
+    </w:p>
+    <w:p>
+      <w:pPr>
+        <w:spacing w:after="200" w:line="300" w:lineRule="auto"/>
+        <w:jc w:val="both"/>
+      </w:pPr>
+      <w:r>
+        <w:rPr>
+          <w:rFonts w:ascii="Times New Roman" w:hAnsi="Times New Roman"/>
+          <w:sz w:val="24"/>
+        </w:rPr>
+        <w:t>Below are placeholders representing the core layout components. [Refer to the screenshots in the docs folder for final visuals]:</w:t>
+        <w:br/>
+        <w:br/>
+        <w:t>• [Insert Figure 1: 3D Galaxy Explorer View] — Displays files as rotating planetary spheres orbiting constellation stars, with depth color mappings.</w:t>
+        <w:br/>
+        <w:br/>
+        <w:t>• [Insert Figure 2: AI Mission Control Panel] — Side-pane chat window showing code questions, responses, and clickable path citations.</w:t>
+        <w:br/>
+        <w:br/>
+        <w:t>• [Insert Figure 3: Skills Console overlay] — Displays custom analysis reports (Overview, Security audits, health scorecards) with the explicit Execute button.</w:t>
       </w:r>
     </w:p>
     <w:p>
@@ -1815,7 +2283,7 @@
     <w:p>
       <w:pPr>
         <w:keepNext/>
-        <w:spacing w:before="240" w:after="120"/>
+        <w:spacing w:before="360" w:after="160"/>
         <w:jc w:val="center"/>
       </w:pPr>
       <w:r>
@@ -1823,33 +2291,37 @@
           <w:rFonts w:ascii="Times New Roman" w:hAnsi="Times New Roman"/>
           <w:b/>
           <w:color w:val="000000"/>
-          <w:sz w:val="28"/>
+          <w:sz w:val="32"/>
         </w:rPr>
         <w:t>12. BIBLIOGRAPHY</w:t>
       </w:r>
     </w:p>
+    <w:p/>
     <w:p>
       <w:pPr>
-        <w:spacing w:line="300" w:lineRule="auto"/>
+        <w:spacing w:line="312" w:lineRule="auto"/>
       </w:pPr>
       <w:r>
         <w:rPr>
           <w:rFonts w:ascii="Times New Roman" w:hAnsi="Times New Roman"/>
-          <w:sz w:val="22"/>
+          <w:sz w:val="23"/>
         </w:rPr>
-        <w:t>• FastAPI Web Framework Documentation. https://fastapi.tiangolo.com/ - Consulted for REST API architectures, WebSockets, and startup lifecycles.</w:t>
+        <w:t>• FastAPI Framework Reference. https://fastapi.tiangolo.com/ - Consulted for ASGI standard specifications, request routing, and WebSockets logic.</w:t>
         <w:br/>
         <w:br/>
-        <w:t>• LangChain Documentation and Conceptual Guidelines. https://python.langchain.com/ - Utilized for constructing prompt structures, memory state, and vector chains.</w:t>
+        <w:t>• LangGraph State Management Guide. https://langchain-ai.github.io/langgraph/ - Referenced for building routing nodes, conditional branches, and conversation histories.</w:t>
         <w:br/>
         <w:br/>
-        <w:t>• Chroma DB: The AI-native open-source vector database. https://www.trychroma.com/ - Referenced for embedding indexing, persistent client setups, and similarity queries.</w:t>
+        <w:t>• ChromaDB Persistent Storage. https://www.trychroma.com/ - Consulted for collection parameters, sqlite indexing, and embedding queries.</w:t>
         <w:br/>
         <w:br/>
-        <w:t>• React Three Fiber (Three.js) Documentation. https://docs.pmnd.rs/react-three-fiber - Consulted for canvas settings, orbit control hooks, and 3D web rendering configurations.</w:t>
+        <w:t>• React Three Fiber 3D Graphics. https://docs.pmnd.rs/react-three-fiber - Referenced for WebGL canvas setups, point controls, and planetary coordinate calculations.</w:t>
         <w:br/>
         <w:br/>
-        <w:t>• Groq Developer Documentation. https://console.groq.com/docs - Utilized for setting model parameters (llama-3.3-70b-versatile) and token usage limits.</w:t>
+        <w:t>• Hugging Face Spaces Docker and Static Hosting. https://huggingface.co/docs/hub/spaces - Consulted for iframe sandbox definitions, folder structures, and relative assets configurations.</w:t>
+        <w:br/>
+        <w:br/>
+        <w:t>• Groq LLM Speeds and speculative decoding metrics. https://console.groq.com/docs - Referenced for temperature tuning, token limitations, and API completion performance.</w:t>
       </w:r>
     </w:p>
     <w:sectPr>

</xml_diff>